<commit_message>
Fix empty table of contents in project report
Replace the dynamic TOC field (which required the viewer to manually
update fields to populate) with a static, clickable list of section
and subsection links built from bookmarks on each heading.
</commit_message>
<xml_diff>
--- a/docs/ALDIWAN_Project_Report.docx
+++ b/docs/ALDIWAN_Project_Report.docx
@@ -88,31 +88,412 @@
     <w:p>
       <w:pPr>
         <w:pStyle w:val="Heading1"/>
-        <w:spacing w:after="200" w:before="400"/>
+        <w:spacing w:after="300" w:before="0"/>
       </w:pPr>
       <w:r>
         <w:t xml:space="preserve">Table of Contents</w:t>
       </w:r>
     </w:p>
-    <w:sdt>
-      <w:sdtPr>
-        <w:alias w:val="Table of Contents"/>
-      </w:sdtPr>
-      <w:sdtContent>
-        <w:p>
-          <w:r>
-            <w:fldChar w:fldCharType="begin" w:dirty="true"/>
-            <w:instrText xml:space="preserve">TOC \h \o "1-2"</w:instrText>
-            <w:fldChar w:fldCharType="separate"/>
-          </w:r>
-        </w:p>
-        <w:p>
-          <w:r>
-            <w:fldChar w:fldCharType="end"/>
-          </w:r>
-        </w:p>
-      </w:sdtContent>
-    </w:sdt>
+    <w:p>
+      <w:pPr>
+        <w:tabs>
+          <w:tab w:val="right" w:pos="9026"/>
+        </w:tabs>
+        <w:spacing w:after="120"/>
+        <w:ind w:left="0"/>
+      </w:pPr>
+      <w:hyperlink w:history="1" w:anchor="bm_1">
+        <w:r>
+          <w:rPr>
+            <w:b/>
+            <w:bCs/>
+            <w:color w:val="2D3B40"/>
+            <w:u w:val="single"/>
+          </w:rPr>
+          <w:t xml:space="preserve">1. Introduction</w:t>
+        </w:r>
+      </w:hyperlink>
+    </w:p>
+    <w:p>
+      <w:pPr>
+        <w:tabs>
+          <w:tab w:val="right" w:pos="9026"/>
+        </w:tabs>
+        <w:spacing w:after="60"/>
+        <w:ind w:left="480"/>
+      </w:pPr>
+      <w:hyperlink w:history="1" w:anchor="bm_2">
+        <w:r>
+          <w:rPr>
+            <w:b w:val="false"/>
+            <w:bCs w:val="false"/>
+            <w:color w:val="2D3B40"/>
+            <w:u w:val="single"/>
+          </w:rPr>
+          <w:t xml:space="preserve">1.1 Objectives</w:t>
+        </w:r>
+      </w:hyperlink>
+    </w:p>
+    <w:p>
+      <w:pPr>
+        <w:tabs>
+          <w:tab w:val="right" w:pos="9026"/>
+        </w:tabs>
+        <w:spacing w:after="120"/>
+        <w:ind w:left="0"/>
+      </w:pPr>
+      <w:hyperlink w:history="1" w:anchor="bm_3">
+        <w:r>
+          <w:rPr>
+            <w:b/>
+            <w:bCs/>
+            <w:color w:val="2D3B40"/>
+            <w:u w:val="single"/>
+          </w:rPr>
+          <w:t xml:space="preserve">2. System Overview</w:t>
+        </w:r>
+      </w:hyperlink>
+    </w:p>
+    <w:p>
+      <w:pPr>
+        <w:tabs>
+          <w:tab w:val="right" w:pos="9026"/>
+        </w:tabs>
+        <w:spacing w:after="60"/>
+        <w:ind w:left="480"/>
+      </w:pPr>
+      <w:hyperlink w:history="1" w:anchor="bm_4">
+        <w:r>
+          <w:rPr>
+            <w:b w:val="false"/>
+            <w:bCs w:val="false"/>
+            <w:color w:val="2D3B40"/>
+            <w:u w:val="single"/>
+          </w:rPr>
+          <w:t xml:space="preserve">2.1 Core Features</w:t>
+        </w:r>
+      </w:hyperlink>
+    </w:p>
+    <w:p>
+      <w:pPr>
+        <w:tabs>
+          <w:tab w:val="right" w:pos="9026"/>
+        </w:tabs>
+        <w:spacing w:after="60"/>
+        <w:ind w:left="480"/>
+      </w:pPr>
+      <w:hyperlink w:history="1" w:anchor="bm_5">
+        <w:r>
+          <w:rPr>
+            <w:b w:val="false"/>
+            <w:bCs w:val="false"/>
+            <w:color w:val="2D3B40"/>
+            <w:u w:val="single"/>
+          </w:rPr>
+          <w:t xml:space="preserve">2.2 User Roles</w:t>
+        </w:r>
+      </w:hyperlink>
+    </w:p>
+    <w:p>
+      <w:pPr>
+        <w:tabs>
+          <w:tab w:val="right" w:pos="9026"/>
+        </w:tabs>
+        <w:spacing w:after="120"/>
+        <w:ind w:left="0"/>
+      </w:pPr>
+      <w:hyperlink w:history="1" w:anchor="bm_6">
+        <w:r>
+          <w:rPr>
+            <w:b/>
+            <w:bCs/>
+            <w:color w:val="2D3B40"/>
+            <w:u w:val="single"/>
+          </w:rPr>
+          <w:t xml:space="preserve">3. Architecture and Design</w:t>
+        </w:r>
+      </w:hyperlink>
+    </w:p>
+    <w:p>
+      <w:pPr>
+        <w:tabs>
+          <w:tab w:val="right" w:pos="9026"/>
+        </w:tabs>
+        <w:spacing w:after="60"/>
+        <w:ind w:left="480"/>
+      </w:pPr>
+      <w:hyperlink w:history="1" w:anchor="bm_7">
+        <w:r>
+          <w:rPr>
+            <w:b w:val="false"/>
+            <w:bCs w:val="false"/>
+            <w:color w:val="2D3B40"/>
+            <w:u w:val="single"/>
+          </w:rPr>
+          <w:t xml:space="preserve">3.1 Class Overview</w:t>
+        </w:r>
+      </w:hyperlink>
+    </w:p>
+    <w:p>
+      <w:pPr>
+        <w:tabs>
+          <w:tab w:val="right" w:pos="9026"/>
+        </w:tabs>
+        <w:spacing w:after="60"/>
+        <w:ind w:left="480"/>
+      </w:pPr>
+      <w:hyperlink w:history="1" w:anchor="bm_8">
+        <w:r>
+          <w:rPr>
+            <w:b w:val="false"/>
+            <w:bCs w:val="false"/>
+            <w:color w:val="2D3B40"/>
+            <w:u w:val="single"/>
+          </w:rPr>
+          <w:t xml:space="preserve">3.2 Object-Oriented Concepts Applied</w:t>
+        </w:r>
+      </w:hyperlink>
+    </w:p>
+    <w:p>
+      <w:pPr>
+        <w:tabs>
+          <w:tab w:val="right" w:pos="9026"/>
+        </w:tabs>
+        <w:spacing w:after="60"/>
+        <w:ind w:left="480"/>
+      </w:pPr>
+      <w:hyperlink w:history="1" w:anchor="bm_9">
+        <w:r>
+          <w:rPr>
+            <w:b w:val="false"/>
+            <w:bCs w:val="false"/>
+            <w:color w:val="2D3B40"/>
+            <w:u w:val="single"/>
+          </w:rPr>
+          <w:t xml:space="preserve">3.3 Application Flow</w:t>
+        </w:r>
+      </w:hyperlink>
+    </w:p>
+    <w:p>
+      <w:pPr>
+        <w:tabs>
+          <w:tab w:val="right" w:pos="9026"/>
+        </w:tabs>
+        <w:spacing w:after="120"/>
+        <w:ind w:left="0"/>
+      </w:pPr>
+      <w:hyperlink w:history="1" w:anchor="bm_10">
+        <w:r>
+          <w:rPr>
+            <w:b/>
+            <w:bCs/>
+            <w:color w:val="2D3B40"/>
+            <w:u w:val="single"/>
+          </w:rPr>
+          <w:t xml:space="preserve">4. Database Design</w:t>
+        </w:r>
+      </w:hyperlink>
+    </w:p>
+    <w:p>
+      <w:pPr>
+        <w:tabs>
+          <w:tab w:val="right" w:pos="9026"/>
+        </w:tabs>
+        <w:spacing w:after="60"/>
+        <w:ind w:left="480"/>
+      </w:pPr>
+      <w:hyperlink w:history="1" w:anchor="bm_11">
+        <w:r>
+          <w:rPr>
+            <w:b w:val="false"/>
+            <w:bCs w:val="false"/>
+            <w:color w:val="2D3B40"/>
+            <w:u w:val="single"/>
+          </w:rPr>
+          <w:t xml:space="preserve">4.1 Tables</w:t>
+        </w:r>
+      </w:hyperlink>
+    </w:p>
+    <w:p>
+      <w:pPr>
+        <w:tabs>
+          <w:tab w:val="right" w:pos="9026"/>
+        </w:tabs>
+        <w:spacing w:after="60"/>
+        <w:ind w:left="480"/>
+      </w:pPr>
+      <w:hyperlink w:history="1" w:anchor="bm_12">
+        <w:r>
+          <w:rPr>
+            <w:b w:val="false"/>
+            <w:bCs w:val="false"/>
+            <w:color w:val="2D3B40"/>
+            <w:u w:val="single"/>
+          </w:rPr>
+          <w:t xml:space="preserve">4.2 Relationships</w:t>
+        </w:r>
+      </w:hyperlink>
+    </w:p>
+    <w:p>
+      <w:pPr>
+        <w:tabs>
+          <w:tab w:val="right" w:pos="9026"/>
+        </w:tabs>
+        <w:spacing w:after="120"/>
+        <w:ind w:left="0"/>
+      </w:pPr>
+      <w:hyperlink w:history="1" w:anchor="bm_13">
+        <w:r>
+          <w:rPr>
+            <w:b/>
+            <w:bCs/>
+            <w:color w:val="2D3B40"/>
+            <w:u w:val="single"/>
+          </w:rPr>
+          <w:t xml:space="preserve">5. Technology Stack</w:t>
+        </w:r>
+      </w:hyperlink>
+    </w:p>
+    <w:p>
+      <w:pPr>
+        <w:tabs>
+          <w:tab w:val="right" w:pos="9026"/>
+        </w:tabs>
+        <w:spacing w:after="120"/>
+        <w:ind w:left="0"/>
+      </w:pPr>
+      <w:hyperlink w:history="1" w:anchor="bm_14">
+        <w:r>
+          <w:rPr>
+            <w:b/>
+            <w:bCs/>
+            <w:color w:val="2D3B40"/>
+            <w:u w:val="single"/>
+          </w:rPr>
+          <w:t xml:space="preserve">6. Project Structure</w:t>
+        </w:r>
+      </w:hyperlink>
+    </w:p>
+    <w:p>
+      <w:pPr>
+        <w:tabs>
+          <w:tab w:val="right" w:pos="9026"/>
+        </w:tabs>
+        <w:spacing w:after="120"/>
+        <w:ind w:left="0"/>
+      </w:pPr>
+      <w:hyperlink w:history="1" w:anchor="bm_15">
+        <w:r>
+          <w:rPr>
+            <w:b/>
+            <w:bCs/>
+            <w:color w:val="2D3B40"/>
+            <w:u w:val="single"/>
+          </w:rPr>
+          <w:t xml:space="preserve">7. Setup and Usage</w:t>
+        </w:r>
+      </w:hyperlink>
+    </w:p>
+    <w:p>
+      <w:pPr>
+        <w:tabs>
+          <w:tab w:val="right" w:pos="9026"/>
+        </w:tabs>
+        <w:spacing w:after="60"/>
+        <w:ind w:left="480"/>
+      </w:pPr>
+      <w:hyperlink w:history="1" w:anchor="bm_16">
+        <w:r>
+          <w:rPr>
+            <w:b w:val="false"/>
+            <w:bCs w:val="false"/>
+            <w:color w:val="2D3B40"/>
+            <w:u w:val="single"/>
+          </w:rPr>
+          <w:t xml:space="preserve">7.1 Prerequisites</w:t>
+        </w:r>
+      </w:hyperlink>
+    </w:p>
+    <w:p>
+      <w:pPr>
+        <w:tabs>
+          <w:tab w:val="right" w:pos="9026"/>
+        </w:tabs>
+        <w:spacing w:after="60"/>
+        <w:ind w:left="480"/>
+      </w:pPr>
+      <w:hyperlink w:history="1" w:anchor="bm_17">
+        <w:r>
+          <w:rPr>
+            <w:b w:val="false"/>
+            <w:bCs w:val="false"/>
+            <w:color w:val="2D3B40"/>
+            <w:u w:val="single"/>
+          </w:rPr>
+          <w:t xml:space="preserve">7.2 Steps</w:t>
+        </w:r>
+      </w:hyperlink>
+    </w:p>
+    <w:p>
+      <w:pPr>
+        <w:tabs>
+          <w:tab w:val="right" w:pos="9026"/>
+        </w:tabs>
+        <w:spacing w:after="60"/>
+        <w:ind w:left="480"/>
+      </w:pPr>
+      <w:hyperlink w:history="1" w:anchor="bm_18">
+        <w:r>
+          <w:rPr>
+            <w:b w:val="false"/>
+            <w:bCs w:val="false"/>
+            <w:color w:val="2D3B40"/>
+            <w:u w:val="single"/>
+          </w:rPr>
+          <w:t xml:space="preserve">7.3 Sample Accounts</w:t>
+        </w:r>
+      </w:hyperlink>
+    </w:p>
+    <w:p>
+      <w:pPr>
+        <w:tabs>
+          <w:tab w:val="right" w:pos="9026"/>
+        </w:tabs>
+        <w:spacing w:after="120"/>
+        <w:ind w:left="0"/>
+      </w:pPr>
+      <w:hyperlink w:history="1" w:anchor="bm_19">
+        <w:r>
+          <w:rPr>
+            <w:b/>
+            <w:bCs/>
+            <w:color w:val="2D3B40"/>
+            <w:u w:val="single"/>
+          </w:rPr>
+          <w:t xml:space="preserve">8. Conclusion</w:t>
+        </w:r>
+      </w:hyperlink>
+    </w:p>
+    <w:p>
+      <w:pPr>
+        <w:tabs>
+          <w:tab w:val="right" w:pos="9026"/>
+        </w:tabs>
+        <w:spacing w:after="60"/>
+        <w:ind w:left="480"/>
+      </w:pPr>
+      <w:hyperlink w:history="1" w:anchor="bm_20">
+        <w:r>
+          <w:rPr>
+            <w:b w:val="false"/>
+            <w:bCs w:val="false"/>
+            <w:color w:val="2D3B40"/>
+            <w:u w:val="single"/>
+          </w:rPr>
+          <w:t xml:space="preserve">Possible Future Improvements</w:t>
+        </w:r>
+      </w:hyperlink>
+    </w:p>
     <w:p>
       <w:r>
         <w:br w:type="page"/>
@@ -123,9 +504,11 @@
         <w:pStyle w:val="Heading1"/>
         <w:spacing w:after="200" w:before="400"/>
       </w:pPr>
+      <w:bookmarkStart w:name="bm_1" w:id="1"/>
       <w:r>
         <w:t xml:space="preserve">1. Introduction</w:t>
       </w:r>
+      <w:bookmarkEnd w:id="1"/>
     </w:p>
     <w:p>
       <w:pPr>
@@ -148,9 +531,11 @@
         <w:pStyle w:val="Heading2"/>
         <w:spacing w:after="150" w:before="300"/>
       </w:pPr>
+      <w:bookmarkStart w:name="bm_2" w:id="1"/>
       <w:r>
         <w:t xml:space="preserve">1.1 Objectives</w:t>
       </w:r>
+      <w:bookmarkEnd w:id="1"/>
     </w:p>
     <w:p>
       <w:pPr>
@@ -209,9 +594,11 @@
         <w:pStyle w:val="Heading1"/>
         <w:spacing w:after="200" w:before="400"/>
       </w:pPr>
+      <w:bookmarkStart w:name="bm_3" w:id="1"/>
       <w:r>
         <w:t xml:space="preserve">2. System Overview</w:t>
       </w:r>
+      <w:bookmarkEnd w:id="1"/>
     </w:p>
     <w:p>
       <w:pPr>
@@ -252,9 +639,11 @@
         <w:pStyle w:val="Heading2"/>
         <w:spacing w:after="150" w:before="300"/>
       </w:pPr>
+      <w:bookmarkStart w:name="bm_4" w:id="1"/>
       <w:r>
         <w:t xml:space="preserve">2.1 Core Features</w:t>
       </w:r>
+      <w:bookmarkEnd w:id="1"/>
     </w:p>
     <w:p>
       <w:pPr>
@@ -352,9 +741,11 @@
         <w:pStyle w:val="Heading2"/>
         <w:spacing w:after="150" w:before="300"/>
       </w:pPr>
+      <w:bookmarkStart w:name="bm_5" w:id="1"/>
       <w:r>
         <w:t xml:space="preserve">2.2 User Roles</w:t>
       </w:r>
+      <w:bookmarkEnd w:id="1"/>
     </w:p>
     <w:tbl>
       <w:tblPr>
@@ -586,9 +977,11 @@
         <w:pStyle w:val="Heading1"/>
         <w:spacing w:after="200" w:before="400"/>
       </w:pPr>
+      <w:bookmarkStart w:name="bm_6" w:id="1"/>
       <w:r>
         <w:t xml:space="preserve">3. Architecture and Design</w:t>
       </w:r>
+      <w:bookmarkEnd w:id="1"/>
     </w:p>
     <w:p>
       <w:pPr>
@@ -603,9 +996,11 @@
         <w:pStyle w:val="Heading2"/>
         <w:spacing w:after="150" w:before="300"/>
       </w:pPr>
+      <w:bookmarkStart w:name="bm_7" w:id="1"/>
       <w:r>
         <w:t xml:space="preserve">3.1 Class Overview</w:t>
       </w:r>
+      <w:bookmarkEnd w:id="1"/>
     </w:p>
     <w:tbl>
       <w:tblPr>
@@ -1091,9 +1486,11 @@
         <w:pStyle w:val="Heading2"/>
         <w:spacing w:after="150" w:before="300"/>
       </w:pPr>
+      <w:bookmarkStart w:name="bm_8" w:id="1"/>
       <w:r>
         <w:t xml:space="preserve">3.2 Object-Oriented Concepts Applied</w:t>
       </w:r>
+      <w:bookmarkEnd w:id="1"/>
     </w:p>
     <w:p>
       <w:pPr>
@@ -1152,9 +1549,11 @@
         <w:pStyle w:val="Heading2"/>
         <w:spacing w:after="150" w:before="300"/>
       </w:pPr>
+      <w:bookmarkStart w:name="bm_9" w:id="1"/>
       <w:r>
         <w:t xml:space="preserve">3.3 Application Flow</w:t>
       </w:r>
+      <w:bookmarkEnd w:id="1"/>
     </w:p>
     <w:p>
       <w:pPr>
@@ -1226,9 +1625,11 @@
         <w:pStyle w:val="Heading1"/>
         <w:spacing w:after="200" w:before="400"/>
       </w:pPr>
+      <w:bookmarkStart w:name="bm_10" w:id="1"/>
       <w:r>
         <w:t xml:space="preserve">4. Database Design</w:t>
       </w:r>
+      <w:bookmarkEnd w:id="1"/>
     </w:p>
     <w:p>
       <w:pPr>
@@ -1243,9 +1644,11 @@
         <w:pStyle w:val="Heading2"/>
         <w:spacing w:after="150" w:before="300"/>
       </w:pPr>
+      <w:bookmarkStart w:name="bm_11" w:id="1"/>
       <w:r>
         <w:t xml:space="preserve">4.1 Tables</w:t>
       </w:r>
+      <w:bookmarkEnd w:id="1"/>
     </w:p>
     <w:tbl>
       <w:tblPr>
@@ -1749,9 +2152,11 @@
         <w:pStyle w:val="Heading2"/>
         <w:spacing w:after="150" w:before="300"/>
       </w:pPr>
+      <w:bookmarkStart w:name="bm_12" w:id="1"/>
       <w:r>
         <w:t xml:space="preserve">4.2 Relationships</w:t>
       </w:r>
+      <w:bookmarkEnd w:id="1"/>
     </w:p>
     <w:p>
       <w:pPr>
@@ -1797,9 +2202,11 @@
         <w:pStyle w:val="Heading1"/>
         <w:spacing w:after="200" w:before="400"/>
       </w:pPr>
+      <w:bookmarkStart w:name="bm_13" w:id="1"/>
       <w:r>
         <w:t xml:space="preserve">5. Technology Stack</w:t>
       </w:r>
+      <w:bookmarkEnd w:id="1"/>
     </w:p>
     <w:tbl>
       <w:tblPr>
@@ -2193,18 +2600,17 @@
         <w:pStyle w:val="Heading1"/>
         <w:spacing w:after="200" w:before="400"/>
       </w:pPr>
+      <w:bookmarkStart w:name="bm_14" w:id="1"/>
       <w:r>
         <w:t xml:space="preserve">6. Project Structure</w:t>
       </w:r>
+      <w:bookmarkEnd w:id="1"/>
     </w:p>
     <w:p>
       <w:pPr>
         <w:spacing w:after="150"/>
       </w:pPr>
       <w:r>
-        <w:rPr>
-          <w:rFonts w:ascii="Consolas" w:cs="Consolas" w:eastAsia="Consolas" w:hAnsi="Consolas"/>
-        </w:rPr>
         <w:t xml:space="preserve">ALDIWAN6/</w:t>
       </w:r>
     </w:p>
@@ -2286,18 +2692,22 @@
         <w:pStyle w:val="Heading1"/>
         <w:spacing w:after="200" w:before="400"/>
       </w:pPr>
+      <w:bookmarkStart w:name="bm_15" w:id="1"/>
       <w:r>
         <w:t xml:space="preserve">7. Setup and Usage</w:t>
       </w:r>
+      <w:bookmarkEnd w:id="1"/>
     </w:p>
     <w:p>
       <w:pPr>
         <w:pStyle w:val="Heading2"/>
         <w:spacing w:after="150" w:before="300"/>
       </w:pPr>
+      <w:bookmarkStart w:name="bm_16" w:id="1"/>
       <w:r>
         <w:t xml:space="preserve">7.1 Prerequisites</w:t>
       </w:r>
+      <w:bookmarkEnd w:id="1"/>
     </w:p>
     <w:p>
       <w:pPr>
@@ -2343,9 +2753,11 @@
         <w:pStyle w:val="Heading2"/>
         <w:spacing w:after="150" w:before="300"/>
       </w:pPr>
+      <w:bookmarkStart w:name="bm_17" w:id="1"/>
       <w:r>
         <w:t xml:space="preserve">7.2 Steps</w:t>
       </w:r>
+      <w:bookmarkEnd w:id="1"/>
     </w:p>
     <w:p>
       <w:pPr>
@@ -2391,9 +2803,11 @@
         <w:pStyle w:val="Heading2"/>
         <w:spacing w:after="150" w:before="300"/>
       </w:pPr>
+      <w:bookmarkStart w:name="bm_18" w:id="1"/>
       <w:r>
         <w:t xml:space="preserve">7.3 Sample Accounts</w:t>
       </w:r>
+      <w:bookmarkEnd w:id="1"/>
     </w:p>
     <w:p>
       <w:pPr>
@@ -2408,9 +2822,11 @@
         <w:pStyle w:val="Heading1"/>
         <w:spacing w:after="200" w:before="400"/>
       </w:pPr>
+      <w:bookmarkStart w:name="bm_19" w:id="1"/>
       <w:r>
         <w:t xml:space="preserve">8. Conclusion</w:t>
       </w:r>
+      <w:bookmarkEnd w:id="1"/>
     </w:p>
     <w:p>
       <w:pPr>
@@ -2425,9 +2841,11 @@
         <w:pStyle w:val="Heading2"/>
         <w:spacing w:after="150" w:before="300"/>
       </w:pPr>
+      <w:bookmarkStart w:name="bm_20" w:id="1"/>
       <w:r>
         <w:t xml:space="preserve">Possible Future Improvements</w:t>
       </w:r>
+      <w:bookmarkEnd w:id="1"/>
     </w:p>
     <w:p>
       <w:pPr>

</xml_diff>

<commit_message>
Fix duplicate bookmark IDs breaking TOC links
Every heading bookmark was being generated with the same internal
w:id by docx-js's Bookmark helper, so every table-of-contents link
resolved to the same location instead of its own section. Build
BookmarkStart/BookmarkEnd directly with unique incrementing IDs.
</commit_message>
<xml_diff>
--- a/docs/ALDIWAN_Project_Report.docx
+++ b/docs/ALDIWAN_Project_Report.docx
@@ -531,11 +531,11 @@
         <w:pStyle w:val="Heading2"/>
         <w:spacing w:after="150" w:before="300"/>
       </w:pPr>
-      <w:bookmarkStart w:name="bm_2" w:id="1"/>
+      <w:bookmarkStart w:name="bm_2" w:id="2"/>
       <w:r>
         <w:t xml:space="preserve">1.1 Objectives</w:t>
       </w:r>
-      <w:bookmarkEnd w:id="1"/>
+      <w:bookmarkEnd w:id="2"/>
     </w:p>
     <w:p>
       <w:pPr>
@@ -594,11 +594,11 @@
         <w:pStyle w:val="Heading1"/>
         <w:spacing w:after="200" w:before="400"/>
       </w:pPr>
-      <w:bookmarkStart w:name="bm_3" w:id="1"/>
+      <w:bookmarkStart w:name="bm_3" w:id="3"/>
       <w:r>
         <w:t xml:space="preserve">2. System Overview</w:t>
       </w:r>
-      <w:bookmarkEnd w:id="1"/>
+      <w:bookmarkEnd w:id="3"/>
     </w:p>
     <w:p>
       <w:pPr>
@@ -639,11 +639,11 @@
         <w:pStyle w:val="Heading2"/>
         <w:spacing w:after="150" w:before="300"/>
       </w:pPr>
-      <w:bookmarkStart w:name="bm_4" w:id="1"/>
+      <w:bookmarkStart w:name="bm_4" w:id="4"/>
       <w:r>
         <w:t xml:space="preserve">2.1 Core Features</w:t>
       </w:r>
-      <w:bookmarkEnd w:id="1"/>
+      <w:bookmarkEnd w:id="4"/>
     </w:p>
     <w:p>
       <w:pPr>
@@ -741,11 +741,11 @@
         <w:pStyle w:val="Heading2"/>
         <w:spacing w:after="150" w:before="300"/>
       </w:pPr>
-      <w:bookmarkStart w:name="bm_5" w:id="1"/>
+      <w:bookmarkStart w:name="bm_5" w:id="5"/>
       <w:r>
         <w:t xml:space="preserve">2.2 User Roles</w:t>
       </w:r>
-      <w:bookmarkEnd w:id="1"/>
+      <w:bookmarkEnd w:id="5"/>
     </w:p>
     <w:tbl>
       <w:tblPr>
@@ -977,11 +977,11 @@
         <w:pStyle w:val="Heading1"/>
         <w:spacing w:after="200" w:before="400"/>
       </w:pPr>
-      <w:bookmarkStart w:name="bm_6" w:id="1"/>
+      <w:bookmarkStart w:name="bm_6" w:id="6"/>
       <w:r>
         <w:t xml:space="preserve">3. Architecture and Design</w:t>
       </w:r>
-      <w:bookmarkEnd w:id="1"/>
+      <w:bookmarkEnd w:id="6"/>
     </w:p>
     <w:p>
       <w:pPr>
@@ -996,11 +996,11 @@
         <w:pStyle w:val="Heading2"/>
         <w:spacing w:after="150" w:before="300"/>
       </w:pPr>
-      <w:bookmarkStart w:name="bm_7" w:id="1"/>
+      <w:bookmarkStart w:name="bm_7" w:id="7"/>
       <w:r>
         <w:t xml:space="preserve">3.1 Class Overview</w:t>
       </w:r>
-      <w:bookmarkEnd w:id="1"/>
+      <w:bookmarkEnd w:id="7"/>
     </w:p>
     <w:tbl>
       <w:tblPr>
@@ -1486,11 +1486,11 @@
         <w:pStyle w:val="Heading2"/>
         <w:spacing w:after="150" w:before="300"/>
       </w:pPr>
-      <w:bookmarkStart w:name="bm_8" w:id="1"/>
+      <w:bookmarkStart w:name="bm_8" w:id="8"/>
       <w:r>
         <w:t xml:space="preserve">3.2 Object-Oriented Concepts Applied</w:t>
       </w:r>
-      <w:bookmarkEnd w:id="1"/>
+      <w:bookmarkEnd w:id="8"/>
     </w:p>
     <w:p>
       <w:pPr>
@@ -1549,11 +1549,11 @@
         <w:pStyle w:val="Heading2"/>
         <w:spacing w:after="150" w:before="300"/>
       </w:pPr>
-      <w:bookmarkStart w:name="bm_9" w:id="1"/>
+      <w:bookmarkStart w:name="bm_9" w:id="9"/>
       <w:r>
         <w:t xml:space="preserve">3.3 Application Flow</w:t>
       </w:r>
-      <w:bookmarkEnd w:id="1"/>
+      <w:bookmarkEnd w:id="9"/>
     </w:p>
     <w:p>
       <w:pPr>
@@ -1625,11 +1625,11 @@
         <w:pStyle w:val="Heading1"/>
         <w:spacing w:after="200" w:before="400"/>
       </w:pPr>
-      <w:bookmarkStart w:name="bm_10" w:id="1"/>
+      <w:bookmarkStart w:name="bm_10" w:id="10"/>
       <w:r>
         <w:t xml:space="preserve">4. Database Design</w:t>
       </w:r>
-      <w:bookmarkEnd w:id="1"/>
+      <w:bookmarkEnd w:id="10"/>
     </w:p>
     <w:p>
       <w:pPr>
@@ -1644,11 +1644,11 @@
         <w:pStyle w:val="Heading2"/>
         <w:spacing w:after="150" w:before="300"/>
       </w:pPr>
-      <w:bookmarkStart w:name="bm_11" w:id="1"/>
+      <w:bookmarkStart w:name="bm_11" w:id="11"/>
       <w:r>
         <w:t xml:space="preserve">4.1 Tables</w:t>
       </w:r>
-      <w:bookmarkEnd w:id="1"/>
+      <w:bookmarkEnd w:id="11"/>
     </w:p>
     <w:tbl>
       <w:tblPr>
@@ -2152,11 +2152,11 @@
         <w:pStyle w:val="Heading2"/>
         <w:spacing w:after="150" w:before="300"/>
       </w:pPr>
-      <w:bookmarkStart w:name="bm_12" w:id="1"/>
+      <w:bookmarkStart w:name="bm_12" w:id="12"/>
       <w:r>
         <w:t xml:space="preserve">4.2 Relationships</w:t>
       </w:r>
-      <w:bookmarkEnd w:id="1"/>
+      <w:bookmarkEnd w:id="12"/>
     </w:p>
     <w:p>
       <w:pPr>
@@ -2202,11 +2202,11 @@
         <w:pStyle w:val="Heading1"/>
         <w:spacing w:after="200" w:before="400"/>
       </w:pPr>
-      <w:bookmarkStart w:name="bm_13" w:id="1"/>
+      <w:bookmarkStart w:name="bm_13" w:id="13"/>
       <w:r>
         <w:t xml:space="preserve">5. Technology Stack</w:t>
       </w:r>
-      <w:bookmarkEnd w:id="1"/>
+      <w:bookmarkEnd w:id="13"/>
     </w:p>
     <w:tbl>
       <w:tblPr>
@@ -2600,11 +2600,11 @@
         <w:pStyle w:val="Heading1"/>
         <w:spacing w:after="200" w:before="400"/>
       </w:pPr>
-      <w:bookmarkStart w:name="bm_14" w:id="1"/>
+      <w:bookmarkStart w:name="bm_14" w:id="14"/>
       <w:r>
         <w:t xml:space="preserve">6. Project Structure</w:t>
       </w:r>
-      <w:bookmarkEnd w:id="1"/>
+      <w:bookmarkEnd w:id="14"/>
     </w:p>
     <w:p>
       <w:pPr>
@@ -2692,22 +2692,22 @@
         <w:pStyle w:val="Heading1"/>
         <w:spacing w:after="200" w:before="400"/>
       </w:pPr>
-      <w:bookmarkStart w:name="bm_15" w:id="1"/>
+      <w:bookmarkStart w:name="bm_15" w:id="15"/>
       <w:r>
         <w:t xml:space="preserve">7. Setup and Usage</w:t>
       </w:r>
-      <w:bookmarkEnd w:id="1"/>
+      <w:bookmarkEnd w:id="15"/>
     </w:p>
     <w:p>
       <w:pPr>
         <w:pStyle w:val="Heading2"/>
         <w:spacing w:after="150" w:before="300"/>
       </w:pPr>
-      <w:bookmarkStart w:name="bm_16" w:id="1"/>
+      <w:bookmarkStart w:name="bm_16" w:id="16"/>
       <w:r>
         <w:t xml:space="preserve">7.1 Prerequisites</w:t>
       </w:r>
-      <w:bookmarkEnd w:id="1"/>
+      <w:bookmarkEnd w:id="16"/>
     </w:p>
     <w:p>
       <w:pPr>
@@ -2753,11 +2753,11 @@
         <w:pStyle w:val="Heading2"/>
         <w:spacing w:after="150" w:before="300"/>
       </w:pPr>
-      <w:bookmarkStart w:name="bm_17" w:id="1"/>
+      <w:bookmarkStart w:name="bm_17" w:id="17"/>
       <w:r>
         <w:t xml:space="preserve">7.2 Steps</w:t>
       </w:r>
-      <w:bookmarkEnd w:id="1"/>
+      <w:bookmarkEnd w:id="17"/>
     </w:p>
     <w:p>
       <w:pPr>
@@ -2803,11 +2803,11 @@
         <w:pStyle w:val="Heading2"/>
         <w:spacing w:after="150" w:before="300"/>
       </w:pPr>
-      <w:bookmarkStart w:name="bm_18" w:id="1"/>
+      <w:bookmarkStart w:name="bm_18" w:id="18"/>
       <w:r>
         <w:t xml:space="preserve">7.3 Sample Accounts</w:t>
       </w:r>
-      <w:bookmarkEnd w:id="1"/>
+      <w:bookmarkEnd w:id="18"/>
     </w:p>
     <w:p>
       <w:pPr>
@@ -2822,11 +2822,11 @@
         <w:pStyle w:val="Heading1"/>
         <w:spacing w:after="200" w:before="400"/>
       </w:pPr>
-      <w:bookmarkStart w:name="bm_19" w:id="1"/>
+      <w:bookmarkStart w:name="bm_19" w:id="19"/>
       <w:r>
         <w:t xml:space="preserve">8. Conclusion</w:t>
       </w:r>
-      <w:bookmarkEnd w:id="1"/>
+      <w:bookmarkEnd w:id="19"/>
     </w:p>
     <w:p>
       <w:pPr>
@@ -2841,11 +2841,11 @@
         <w:pStyle w:val="Heading2"/>
         <w:spacing w:after="150" w:before="300"/>
       </w:pPr>
-      <w:bookmarkStart w:name="bm_20" w:id="1"/>
+      <w:bookmarkStart w:name="bm_20" w:id="20"/>
       <w:r>
         <w:t xml:space="preserve">Possible Future Improvements</w:t>
       </w:r>
-      <w:bookmarkEnd w:id="1"/>
+      <w:bookmarkEnd w:id="20"/>
     </w:p>
     <w:p>
       <w:pPr>

</xml_diff>

<commit_message>
Remove table of contents, em dashes, and force left alignment in report
Drop the TOC section entirely instead of continuing to patch it.
Replace all em dash separators with plain punctuation. Explicitly set
left-to-right direction and left alignment on every paragraph and at
the document defaults level, so the report doesn't pick up a
right-aligned layout from the viewing application's locale settings.
</commit_message>
<xml_diff>
--- a/docs/ALDIWAN_Project_Report.docx
+++ b/docs/ALDIWAN_Project_Report.docx
@@ -4,11 +4,14 @@
   <w:body>
     <w:p>
       <w:pPr>
+        <w:bidi w:val="false"/>
         <w:spacing w:before="2000"/>
-      </w:pPr>
-    </w:p>
-    <w:p>
-      <w:pPr>
+        <w:jc w:val="center"/>
+      </w:pPr>
+    </w:p>
+    <w:p>
+      <w:pPr>
+        <w:bidi w:val="false"/>
         <w:jc w:val="center"/>
       </w:pPr>
       <w:r>
@@ -24,6 +27,7 @@
     </w:p>
     <w:p>
       <w:pPr>
+        <w:bidi w:val="false"/>
         <w:spacing w:after="400" w:before="100"/>
         <w:jc w:val="center"/>
       </w:pPr>
@@ -39,6 +43,7 @@
     </w:p>
     <w:p>
       <w:pPr>
+        <w:bidi w:val="false"/>
         <w:spacing w:before="200"/>
         <w:jc w:val="center"/>
       </w:pPr>
@@ -54,6 +59,7 @@
     </w:p>
     <w:p>
       <w:pPr>
+        <w:bidi w:val="false"/>
         <w:spacing w:before="100"/>
         <w:jc w:val="center"/>
       </w:pPr>
@@ -68,6 +74,7 @@
     </w:p>
     <w:p>
       <w:pPr>
+        <w:bidi w:val="false"/>
         <w:spacing w:before="800"/>
         <w:jc w:val="center"/>
       </w:pPr>
@@ -77,7 +84,7 @@
           <w:sz w:val="22"/>
           <w:szCs w:val="22"/>
         </w:rPr>
-        <w:t xml:space="preserve">Java Swing  |  MySQL  |  NetBeans</w:t>
+        <w:t xml:space="preserve">Java Swing | MySQL | NetBeans</w:t>
       </w:r>
     </w:p>
     <w:p>
@@ -88,664 +95,282 @@
     <w:p>
       <w:pPr>
         <w:pStyle w:val="Heading1"/>
-        <w:spacing w:after="300" w:before="0"/>
-      </w:pPr>
-      <w:r>
-        <w:t xml:space="preserve">Table of Contents</w:t>
-      </w:r>
-    </w:p>
-    <w:p>
-      <w:pPr>
-        <w:tabs>
-          <w:tab w:val="right" w:pos="9026"/>
-        </w:tabs>
-        <w:spacing w:after="120"/>
-        <w:ind w:left="0"/>
-      </w:pPr>
-      <w:hyperlink w:history="1" w:anchor="bm_1">
-        <w:r>
-          <w:rPr>
-            <w:b/>
-            <w:bCs/>
-            <w:color w:val="2D3B40"/>
-            <w:u w:val="single"/>
-          </w:rPr>
-          <w:t xml:space="preserve">1. Introduction</w:t>
-        </w:r>
-      </w:hyperlink>
-    </w:p>
-    <w:p>
-      <w:pPr>
-        <w:tabs>
-          <w:tab w:val="right" w:pos="9026"/>
-        </w:tabs>
-        <w:spacing w:after="60"/>
-        <w:ind w:left="480"/>
-      </w:pPr>
-      <w:hyperlink w:history="1" w:anchor="bm_2">
-        <w:r>
-          <w:rPr>
-            <w:b w:val="false"/>
-            <w:bCs w:val="false"/>
-            <w:color w:val="2D3B40"/>
-            <w:u w:val="single"/>
-          </w:rPr>
-          <w:t xml:space="preserve">1.1 Objectives</w:t>
-        </w:r>
-      </w:hyperlink>
-    </w:p>
-    <w:p>
-      <w:pPr>
-        <w:tabs>
-          <w:tab w:val="right" w:pos="9026"/>
-        </w:tabs>
-        <w:spacing w:after="120"/>
-        <w:ind w:left="0"/>
-      </w:pPr>
-      <w:hyperlink w:history="1" w:anchor="bm_3">
-        <w:r>
-          <w:rPr>
-            <w:b/>
-            <w:bCs/>
-            <w:color w:val="2D3B40"/>
-            <w:u w:val="single"/>
-          </w:rPr>
-          <w:t xml:space="preserve">2. System Overview</w:t>
-        </w:r>
-      </w:hyperlink>
-    </w:p>
-    <w:p>
-      <w:pPr>
-        <w:tabs>
-          <w:tab w:val="right" w:pos="9026"/>
-        </w:tabs>
-        <w:spacing w:after="60"/>
-        <w:ind w:left="480"/>
-      </w:pPr>
-      <w:hyperlink w:history="1" w:anchor="bm_4">
-        <w:r>
-          <w:rPr>
-            <w:b w:val="false"/>
-            <w:bCs w:val="false"/>
-            <w:color w:val="2D3B40"/>
-            <w:u w:val="single"/>
-          </w:rPr>
-          <w:t xml:space="preserve">2.1 Core Features</w:t>
-        </w:r>
-      </w:hyperlink>
-    </w:p>
-    <w:p>
-      <w:pPr>
-        <w:tabs>
-          <w:tab w:val="right" w:pos="9026"/>
-        </w:tabs>
-        <w:spacing w:after="60"/>
-        <w:ind w:left="480"/>
-      </w:pPr>
-      <w:hyperlink w:history="1" w:anchor="bm_5">
-        <w:r>
-          <w:rPr>
-            <w:b w:val="false"/>
-            <w:bCs w:val="false"/>
-            <w:color w:val="2D3B40"/>
-            <w:u w:val="single"/>
-          </w:rPr>
-          <w:t xml:space="preserve">2.2 User Roles</w:t>
-        </w:r>
-      </w:hyperlink>
-    </w:p>
-    <w:p>
-      <w:pPr>
-        <w:tabs>
-          <w:tab w:val="right" w:pos="9026"/>
-        </w:tabs>
-        <w:spacing w:after="120"/>
-        <w:ind w:left="0"/>
-      </w:pPr>
-      <w:hyperlink w:history="1" w:anchor="bm_6">
-        <w:r>
-          <w:rPr>
-            <w:b/>
-            <w:bCs/>
-            <w:color w:val="2D3B40"/>
-            <w:u w:val="single"/>
-          </w:rPr>
-          <w:t xml:space="preserve">3. Architecture and Design</w:t>
-        </w:r>
-      </w:hyperlink>
-    </w:p>
-    <w:p>
-      <w:pPr>
-        <w:tabs>
-          <w:tab w:val="right" w:pos="9026"/>
-        </w:tabs>
-        <w:spacing w:after="60"/>
-        <w:ind w:left="480"/>
-      </w:pPr>
-      <w:hyperlink w:history="1" w:anchor="bm_7">
-        <w:r>
-          <w:rPr>
-            <w:b w:val="false"/>
-            <w:bCs w:val="false"/>
-            <w:color w:val="2D3B40"/>
-            <w:u w:val="single"/>
-          </w:rPr>
-          <w:t xml:space="preserve">3.1 Class Overview</w:t>
-        </w:r>
-      </w:hyperlink>
-    </w:p>
-    <w:p>
-      <w:pPr>
-        <w:tabs>
-          <w:tab w:val="right" w:pos="9026"/>
-        </w:tabs>
-        <w:spacing w:after="60"/>
-        <w:ind w:left="480"/>
-      </w:pPr>
-      <w:hyperlink w:history="1" w:anchor="bm_8">
-        <w:r>
-          <w:rPr>
-            <w:b w:val="false"/>
-            <w:bCs w:val="false"/>
-            <w:color w:val="2D3B40"/>
-            <w:u w:val="single"/>
-          </w:rPr>
-          <w:t xml:space="preserve">3.2 Object-Oriented Concepts Applied</w:t>
-        </w:r>
-      </w:hyperlink>
-    </w:p>
-    <w:p>
-      <w:pPr>
-        <w:tabs>
-          <w:tab w:val="right" w:pos="9026"/>
-        </w:tabs>
-        <w:spacing w:after="60"/>
-        <w:ind w:left="480"/>
-      </w:pPr>
-      <w:hyperlink w:history="1" w:anchor="bm_9">
-        <w:r>
-          <w:rPr>
-            <w:b w:val="false"/>
-            <w:bCs w:val="false"/>
-            <w:color w:val="2D3B40"/>
-            <w:u w:val="single"/>
-          </w:rPr>
-          <w:t xml:space="preserve">3.3 Application Flow</w:t>
-        </w:r>
-      </w:hyperlink>
-    </w:p>
-    <w:p>
-      <w:pPr>
-        <w:tabs>
-          <w:tab w:val="right" w:pos="9026"/>
-        </w:tabs>
-        <w:spacing w:after="120"/>
-        <w:ind w:left="0"/>
-      </w:pPr>
-      <w:hyperlink w:history="1" w:anchor="bm_10">
-        <w:r>
-          <w:rPr>
-            <w:b/>
-            <w:bCs/>
-            <w:color w:val="2D3B40"/>
-            <w:u w:val="single"/>
-          </w:rPr>
-          <w:t xml:space="preserve">4. Database Design</w:t>
-        </w:r>
-      </w:hyperlink>
-    </w:p>
-    <w:p>
-      <w:pPr>
-        <w:tabs>
-          <w:tab w:val="right" w:pos="9026"/>
-        </w:tabs>
-        <w:spacing w:after="60"/>
-        <w:ind w:left="480"/>
-      </w:pPr>
-      <w:hyperlink w:history="1" w:anchor="bm_11">
-        <w:r>
-          <w:rPr>
-            <w:b w:val="false"/>
-            <w:bCs w:val="false"/>
-            <w:color w:val="2D3B40"/>
-            <w:u w:val="single"/>
-          </w:rPr>
-          <w:t xml:space="preserve">4.1 Tables</w:t>
-        </w:r>
-      </w:hyperlink>
-    </w:p>
-    <w:p>
-      <w:pPr>
-        <w:tabs>
-          <w:tab w:val="right" w:pos="9026"/>
-        </w:tabs>
-        <w:spacing w:after="60"/>
-        <w:ind w:left="480"/>
-      </w:pPr>
-      <w:hyperlink w:history="1" w:anchor="bm_12">
-        <w:r>
-          <w:rPr>
-            <w:b w:val="false"/>
-            <w:bCs w:val="false"/>
-            <w:color w:val="2D3B40"/>
-            <w:u w:val="single"/>
-          </w:rPr>
-          <w:t xml:space="preserve">4.2 Relationships</w:t>
-        </w:r>
-      </w:hyperlink>
-    </w:p>
-    <w:p>
-      <w:pPr>
-        <w:tabs>
-          <w:tab w:val="right" w:pos="9026"/>
-        </w:tabs>
-        <w:spacing w:after="120"/>
-        <w:ind w:left="0"/>
-      </w:pPr>
-      <w:hyperlink w:history="1" w:anchor="bm_13">
-        <w:r>
-          <w:rPr>
-            <w:b/>
-            <w:bCs/>
-            <w:color w:val="2D3B40"/>
-            <w:u w:val="single"/>
-          </w:rPr>
-          <w:t xml:space="preserve">5. Technology Stack</w:t>
-        </w:r>
-      </w:hyperlink>
-    </w:p>
-    <w:p>
-      <w:pPr>
-        <w:tabs>
-          <w:tab w:val="right" w:pos="9026"/>
-        </w:tabs>
-        <w:spacing w:after="120"/>
-        <w:ind w:left="0"/>
-      </w:pPr>
-      <w:hyperlink w:history="1" w:anchor="bm_14">
-        <w:r>
-          <w:rPr>
-            <w:b/>
-            <w:bCs/>
-            <w:color w:val="2D3B40"/>
-            <w:u w:val="single"/>
-          </w:rPr>
-          <w:t xml:space="preserve">6. Project Structure</w:t>
-        </w:r>
-      </w:hyperlink>
-    </w:p>
-    <w:p>
-      <w:pPr>
-        <w:tabs>
-          <w:tab w:val="right" w:pos="9026"/>
-        </w:tabs>
-        <w:spacing w:after="120"/>
-        <w:ind w:left="0"/>
-      </w:pPr>
-      <w:hyperlink w:history="1" w:anchor="bm_15">
-        <w:r>
-          <w:rPr>
-            <w:b/>
-            <w:bCs/>
-            <w:color w:val="2D3B40"/>
-            <w:u w:val="single"/>
-          </w:rPr>
-          <w:t xml:space="preserve">7. Setup and Usage</w:t>
-        </w:r>
-      </w:hyperlink>
-    </w:p>
-    <w:p>
-      <w:pPr>
-        <w:tabs>
-          <w:tab w:val="right" w:pos="9026"/>
-        </w:tabs>
-        <w:spacing w:after="60"/>
-        <w:ind w:left="480"/>
-      </w:pPr>
-      <w:hyperlink w:history="1" w:anchor="bm_16">
-        <w:r>
-          <w:rPr>
-            <w:b w:val="false"/>
-            <w:bCs w:val="false"/>
-            <w:color w:val="2D3B40"/>
-            <w:u w:val="single"/>
-          </w:rPr>
-          <w:t xml:space="preserve">7.1 Prerequisites</w:t>
-        </w:r>
-      </w:hyperlink>
-    </w:p>
-    <w:p>
-      <w:pPr>
-        <w:tabs>
-          <w:tab w:val="right" w:pos="9026"/>
-        </w:tabs>
-        <w:spacing w:after="60"/>
-        <w:ind w:left="480"/>
-      </w:pPr>
-      <w:hyperlink w:history="1" w:anchor="bm_17">
-        <w:r>
-          <w:rPr>
-            <w:b w:val="false"/>
-            <w:bCs w:val="false"/>
-            <w:color w:val="2D3B40"/>
-            <w:u w:val="single"/>
-          </w:rPr>
-          <w:t xml:space="preserve">7.2 Steps</w:t>
-        </w:r>
-      </w:hyperlink>
-    </w:p>
-    <w:p>
-      <w:pPr>
-        <w:tabs>
-          <w:tab w:val="right" w:pos="9026"/>
-        </w:tabs>
-        <w:spacing w:after="60"/>
-        <w:ind w:left="480"/>
-      </w:pPr>
-      <w:hyperlink w:history="1" w:anchor="bm_18">
-        <w:r>
-          <w:rPr>
-            <w:b w:val="false"/>
-            <w:bCs w:val="false"/>
-            <w:color w:val="2D3B40"/>
-            <w:u w:val="single"/>
-          </w:rPr>
-          <w:t xml:space="preserve">7.3 Sample Accounts</w:t>
-        </w:r>
-      </w:hyperlink>
-    </w:p>
-    <w:p>
-      <w:pPr>
-        <w:tabs>
-          <w:tab w:val="right" w:pos="9026"/>
-        </w:tabs>
-        <w:spacing w:after="120"/>
-        <w:ind w:left="0"/>
-      </w:pPr>
-      <w:hyperlink w:history="1" w:anchor="bm_19">
-        <w:r>
-          <w:rPr>
-            <w:b/>
-            <w:bCs/>
-            <w:color w:val="2D3B40"/>
-            <w:u w:val="single"/>
-          </w:rPr>
-          <w:t xml:space="preserve">8. Conclusion</w:t>
-        </w:r>
-      </w:hyperlink>
-    </w:p>
-    <w:p>
-      <w:pPr>
-        <w:tabs>
-          <w:tab w:val="right" w:pos="9026"/>
-        </w:tabs>
-        <w:spacing w:after="60"/>
-        <w:ind w:left="480"/>
-      </w:pPr>
-      <w:hyperlink w:history="1" w:anchor="bm_20">
-        <w:r>
-          <w:rPr>
-            <w:b w:val="false"/>
-            <w:bCs w:val="false"/>
-            <w:color w:val="2D3B40"/>
-            <w:u w:val="single"/>
-          </w:rPr>
-          <w:t xml:space="preserve">Possible Future Improvements</w:t>
-        </w:r>
-      </w:hyperlink>
-    </w:p>
-    <w:p>
-      <w:r>
-        <w:br w:type="page"/>
+        <w:bidi w:val="false"/>
+        <w:spacing w:after="200" w:before="400"/>
+        <w:jc w:val="left"/>
+      </w:pPr>
+      <w:r>
+        <w:t xml:space="preserve">1. Introduction</w:t>
+      </w:r>
+    </w:p>
+    <w:p>
+      <w:pPr>
+        <w:bidi w:val="false"/>
+        <w:spacing w:after="150"/>
+        <w:jc w:val="left"/>
+      </w:pPr>
+      <w:r>
+        <w:t xml:space="preserve">ALDIWAN is a desktop restaurant management system developed in Java as an Object-Oriented Programming course project. It provides a single application through which restaurant staff can authenticate, take customer orders, process payments, manage takeaway deliveries, and, for managers, monitor staff and sales activity through a visual dashboard.</w:t>
+      </w:r>
+    </w:p>
+    <w:p>
+      <w:pPr>
+        <w:bidi w:val="false"/>
+        <w:spacing w:after="150"/>
+        <w:jc w:val="left"/>
+      </w:pPr>
+      <w:r>
+        <w:t xml:space="preserve">The application is built with Java Swing for the user interface, backed by a MySQL relational database for persistent storage of customers, menu items, orders, payments, and staff records.</w:t>
+      </w:r>
+    </w:p>
+    <w:p>
+      <w:pPr>
+        <w:pStyle w:val="Heading2"/>
+        <w:bidi w:val="false"/>
+        <w:spacing w:after="150" w:before="300"/>
+        <w:jc w:val="left"/>
+      </w:pPr>
+      <w:r>
+        <w:t xml:space="preserve">1.1 Objectives</w:t>
+      </w:r>
+    </w:p>
+    <w:p>
+      <w:pPr>
+        <w:pStyle w:val="ListParagraph"/>
+        <w:numPr>
+          <w:ilvl w:val="0"/>
+          <w:numId w:val="2"/>
+        </w:numPr>
+        <w:bidi w:val="false"/>
+        <w:spacing w:after="80"/>
+        <w:jc w:val="left"/>
+      </w:pPr>
+      <w:r>
+        <w:t xml:space="preserve">Apply core object-oriented design principles (encapsulation, class composition, inheritance from Swing components) in a realistic, multi-screen desktop application.</w:t>
+      </w:r>
+    </w:p>
+    <w:p>
+      <w:pPr>
+        <w:pStyle w:val="ListParagraph"/>
+        <w:numPr>
+          <w:ilvl w:val="0"/>
+          <w:numId w:val="2"/>
+        </w:numPr>
+        <w:bidi w:val="false"/>
+        <w:spacing w:after="80"/>
+        <w:jc w:val="left"/>
+      </w:pPr>
+      <w:r>
+        <w:t xml:space="preserve">Model a small restaurant's operations, including ordering, payment, delivery, and staff administration, as a relational database and a matching set of Java classes.</w:t>
+      </w:r>
+    </w:p>
+    <w:p>
+      <w:pPr>
+        <w:pStyle w:val="ListParagraph"/>
+        <w:numPr>
+          <w:ilvl w:val="0"/>
+          <w:numId w:val="2"/>
+        </w:numPr>
+        <w:bidi w:val="false"/>
+        <w:spacing w:after="80"/>
+        <w:jc w:val="left"/>
+      </w:pPr>
+      <w:r>
+        <w:t xml:space="preserve">Build a role-based application where managers and staff see different views and capabilities.</w:t>
+      </w:r>
+    </w:p>
+    <w:p>
+      <w:pPr>
+        <w:pStyle w:val="ListParagraph"/>
+        <w:numPr>
+          <w:ilvl w:val="0"/>
+          <w:numId w:val="2"/>
+        </w:numPr>
+        <w:bidi w:val="false"/>
+        <w:spacing w:after="80"/>
+        <w:jc w:val="left"/>
+      </w:pPr>
+      <w:r>
+        <w:t xml:space="preserve">Provide a working example of a Java Swing application connected to MySQL via JDBC, packaged as a runnable NetBeans/Ant project.</w:t>
       </w:r>
     </w:p>
     <w:p>
       <w:pPr>
         <w:pStyle w:val="Heading1"/>
+        <w:bidi w:val="false"/>
         <w:spacing w:after="200" w:before="400"/>
-      </w:pPr>
-      <w:bookmarkStart w:name="bm_1" w:id="1"/>
-      <w:r>
-        <w:t xml:space="preserve">1. Introduction</w:t>
-      </w:r>
-      <w:bookmarkEnd w:id="1"/>
-    </w:p>
-    <w:p>
-      <w:pPr>
+        <w:jc w:val="left"/>
+      </w:pPr>
+      <w:r>
+        <w:t xml:space="preserve">2. System Overview</w:t>
+      </w:r>
+    </w:p>
+    <w:p>
+      <w:pPr>
+        <w:bidi w:val="false"/>
         <w:spacing w:after="150"/>
-      </w:pPr>
-      <w:r>
-        <w:t xml:space="preserve">ALDIWAN is a desktop restaurant management system developed in Java as an Object-Oriented Programming course project. It provides a single application through which restaurant staff can authenticate, take customer orders, process payments, manage takeaway deliveries, and — for managers — monitor staff and sales activity through a visual dashboard.</w:t>
-      </w:r>
-    </w:p>
-    <w:p>
-      <w:pPr>
-        <w:spacing w:after="150"/>
-      </w:pPr>
-      <w:r>
-        <w:t xml:space="preserve">The application is built with Java Swing for the user interface, backed by a MySQL relational database for persistent storage of customers, menu items, orders, payments, and staff records.</w:t>
+        <w:jc w:val="left"/>
+      </w:pPr>
+      <w:r>
+        <w:t xml:space="preserve">The system is organized around a login step that routes each user to one of two experiences based on their role:</w:t>
+      </w:r>
+    </w:p>
+    <w:p>
+      <w:pPr>
+        <w:pStyle w:val="ListParagraph"/>
+        <w:numPr>
+          <w:ilvl w:val="0"/>
+          <w:numId w:val="2"/>
+        </w:numPr>
+        <w:bidi w:val="false"/>
+        <w:spacing w:after="80"/>
+        <w:jc w:val="left"/>
+      </w:pPr>
+      <w:r>
+        <w:t xml:space="preserve">Manager: lands on the Dashboard, with charts summarizing staff and order activity, and full control over adding, updating, and deleting staff records.</w:t>
+      </w:r>
+    </w:p>
+    <w:p>
+      <w:pPr>
+        <w:pStyle w:val="ListParagraph"/>
+        <w:numPr>
+          <w:ilvl w:val="0"/>
+          <w:numId w:val="2"/>
+        </w:numPr>
+        <w:bidi w:val="false"/>
+        <w:spacing w:after="80"/>
+        <w:jc w:val="left"/>
+      </w:pPr>
+      <w:r>
+        <w:t xml:space="preserve">User (staff): lands on the Menu screen to take and process customer orders.</w:t>
       </w:r>
     </w:p>
     <w:p>
       <w:pPr>
         <w:pStyle w:val="Heading2"/>
+        <w:bidi w:val="false"/>
         <w:spacing w:after="150" w:before="300"/>
-      </w:pPr>
-      <w:bookmarkStart w:name="bm_2" w:id="2"/>
-      <w:r>
-        <w:t xml:space="preserve">1.1 Objectives</w:t>
-      </w:r>
-      <w:bookmarkEnd w:id="2"/>
-    </w:p>
-    <w:p>
-      <w:pPr>
-        <w:pStyle w:val="ListParagraph"/>
-        <w:numPr>
-          <w:ilvl w:val="0"/>
-          <w:numId w:val="2"/>
-        </w:numPr>
-        <w:spacing w:after="80"/>
-      </w:pPr>
-      <w:r>
-        <w:t xml:space="preserve">Apply core object-oriented design principles (encapsulation, class composition, inheritance from Swing components) in a realistic, multi-screen desktop application.</w:t>
-      </w:r>
-    </w:p>
-    <w:p>
-      <w:pPr>
-        <w:pStyle w:val="ListParagraph"/>
-        <w:numPr>
-          <w:ilvl w:val="0"/>
-          <w:numId w:val="2"/>
-        </w:numPr>
-        <w:spacing w:after="80"/>
-      </w:pPr>
-      <w:r>
-        <w:t xml:space="preserve">Model a small restaurant's operations — ordering, payment, delivery, and staff administration — as a relational database and a matching set of Java classes.</w:t>
-      </w:r>
-    </w:p>
-    <w:p>
-      <w:pPr>
-        <w:pStyle w:val="ListParagraph"/>
-        <w:numPr>
-          <w:ilvl w:val="0"/>
-          <w:numId w:val="2"/>
-        </w:numPr>
-        <w:spacing w:after="80"/>
-      </w:pPr>
-      <w:r>
-        <w:t xml:space="preserve">Build a role-based application where managers and staff see different views and capabilities.</w:t>
-      </w:r>
-    </w:p>
-    <w:p>
-      <w:pPr>
-        <w:pStyle w:val="ListParagraph"/>
-        <w:numPr>
-          <w:ilvl w:val="0"/>
-          <w:numId w:val="2"/>
-        </w:numPr>
-        <w:spacing w:after="80"/>
-      </w:pPr>
-      <w:r>
-        <w:t xml:space="preserve">Provide a working example of a Java Swing application connected to MySQL via JDBC, packaged as a runnable NetBeans/Ant project.</w:t>
-      </w:r>
-    </w:p>
-    <w:p>
-      <w:pPr>
-        <w:pStyle w:val="Heading1"/>
-        <w:spacing w:after="200" w:before="400"/>
-      </w:pPr>
-      <w:bookmarkStart w:name="bm_3" w:id="3"/>
-      <w:r>
-        <w:t xml:space="preserve">2. System Overview</w:t>
-      </w:r>
-      <w:bookmarkEnd w:id="3"/>
-    </w:p>
-    <w:p>
-      <w:pPr>
-        <w:spacing w:after="150"/>
-      </w:pPr>
-      <w:r>
-        <w:t xml:space="preserve">The system is organized around a login step that routes each user to one of two experiences based on their role:</w:t>
-      </w:r>
-    </w:p>
-    <w:p>
-      <w:pPr>
-        <w:pStyle w:val="ListParagraph"/>
-        <w:numPr>
-          <w:ilvl w:val="0"/>
-          <w:numId w:val="2"/>
-        </w:numPr>
-        <w:spacing w:after="80"/>
-      </w:pPr>
-      <w:r>
-        <w:t xml:space="preserve">Manager — lands on the Dashboard, with charts summarizing staff and order activity, and full CRUD control over staff (person) records.</w:t>
-      </w:r>
-    </w:p>
-    <w:p>
-      <w:pPr>
-        <w:pStyle w:val="ListParagraph"/>
-        <w:numPr>
-          <w:ilvl w:val="0"/>
-          <w:numId w:val="2"/>
-        </w:numPr>
-        <w:spacing w:after="80"/>
-      </w:pPr>
-      <w:r>
-        <w:t xml:space="preserve">User (staff) — lands on the Menu screen to take and process customer orders.</w:t>
+        <w:jc w:val="left"/>
+      </w:pPr>
+      <w:r>
+        <w:t xml:space="preserve">2.1 Core Features</w:t>
+      </w:r>
+    </w:p>
+    <w:p>
+      <w:pPr>
+        <w:pStyle w:val="ListParagraph"/>
+        <w:numPr>
+          <w:ilvl w:val="0"/>
+          <w:numId w:val="2"/>
+        </w:numPr>
+        <w:bidi w:val="false"/>
+        <w:spacing w:after="80"/>
+        <w:jc w:val="left"/>
+      </w:pPr>
+      <w:r>
+        <w:t xml:space="preserve">Role-based login with credentials validated against the person table.</w:t>
+      </w:r>
+    </w:p>
+    <w:p>
+      <w:pPr>
+        <w:pStyle w:val="ListParagraph"/>
+        <w:numPr>
+          <w:ilvl w:val="0"/>
+          <w:numId w:val="2"/>
+        </w:numPr>
+        <w:bidi w:val="false"/>
+        <w:spacing w:after="80"/>
+        <w:jc w:val="left"/>
+      </w:pPr>
+      <w:r>
+        <w:t xml:space="preserve">Manager dashboard with live bar and pie charts (JFreeChart), showing manager-to-employee counts, a breakdown of payment types, and orders categorized by Cash, Credit, and Takeaway.</w:t>
+      </w:r>
+    </w:p>
+    <w:p>
+      <w:pPr>
+        <w:pStyle w:val="ListParagraph"/>
+        <w:numPr>
+          <w:ilvl w:val="0"/>
+          <w:numId w:val="2"/>
+        </w:numPr>
+        <w:bidi w:val="false"/>
+        <w:spacing w:after="80"/>
+        <w:jc w:val="left"/>
+      </w:pPr>
+      <w:r>
+        <w:t xml:space="preserve">Staff record management from the dashboard: add, update, and delete person records.</w:t>
+      </w:r>
+    </w:p>
+    <w:p>
+      <w:pPr>
+        <w:pStyle w:val="ListParagraph"/>
+        <w:numPr>
+          <w:ilvl w:val="0"/>
+          <w:numId w:val="2"/>
+        </w:numPr>
+        <w:bidi w:val="false"/>
+        <w:spacing w:after="80"/>
+        <w:jc w:val="left"/>
+      </w:pPr>
+      <w:r>
+        <w:t xml:space="preserve">Menu browsing with item images and prices, and order building with selectable quantity.</w:t>
+      </w:r>
+    </w:p>
+    <w:p>
+      <w:pPr>
+        <w:pStyle w:val="ListParagraph"/>
+        <w:numPr>
+          <w:ilvl w:val="0"/>
+          <w:numId w:val="2"/>
+        </w:numPr>
+        <w:bidi w:val="false"/>
+        <w:spacing w:after="80"/>
+        <w:jc w:val="left"/>
+      </w:pPr>
+      <w:r>
+        <w:t xml:space="preserve">Three payment paths per order: Cash, Credit Card, and Takeaway/Delivery.</w:t>
+      </w:r>
+    </w:p>
+    <w:p>
+      <w:pPr>
+        <w:pStyle w:val="ListParagraph"/>
+        <w:numPr>
+          <w:ilvl w:val="0"/>
+          <w:numId w:val="2"/>
+        </w:numPr>
+        <w:bidi w:val="false"/>
+        <w:spacing w:after="80"/>
+        <w:jc w:val="left"/>
+      </w:pPr>
+      <w:r>
+        <w:t xml:space="preserve">Credit card payment capture, including card number, name on card, and expiry date, linked to the customer and the staff member who processed it.</w:t>
+      </w:r>
+    </w:p>
+    <w:p>
+      <w:pPr>
+        <w:pStyle w:val="ListParagraph"/>
+        <w:numPr>
+          <w:ilvl w:val="0"/>
+          <w:numId w:val="2"/>
+        </w:numPr>
+        <w:bidi w:val="false"/>
+        <w:spacing w:after="80"/>
+        <w:jc w:val="left"/>
+      </w:pPr>
+      <w:r>
+        <w:t xml:space="preserve">Takeaway/delivery handling, including customer name, address, phone, delivery fee, and amount due.</w:t>
       </w:r>
     </w:p>
     <w:p>
       <w:pPr>
         <w:pStyle w:val="Heading2"/>
+        <w:bidi w:val="false"/>
         <w:spacing w:after="150" w:before="300"/>
-      </w:pPr>
-      <w:bookmarkStart w:name="bm_4" w:id="4"/>
-      <w:r>
-        <w:t xml:space="preserve">2.1 Core Features</w:t>
-      </w:r>
-      <w:bookmarkEnd w:id="4"/>
-    </w:p>
-    <w:p>
-      <w:pPr>
-        <w:pStyle w:val="ListParagraph"/>
-        <w:numPr>
-          <w:ilvl w:val="0"/>
-          <w:numId w:val="2"/>
-        </w:numPr>
-        <w:spacing w:after="80"/>
-      </w:pPr>
-      <w:r>
-        <w:t xml:space="preserve">Role-based login with credentials validated against the person table.</w:t>
-      </w:r>
-    </w:p>
-    <w:p>
-      <w:pPr>
-        <w:pStyle w:val="ListParagraph"/>
-        <w:numPr>
-          <w:ilvl w:val="0"/>
-          <w:numId w:val="2"/>
-        </w:numPr>
-        <w:spacing w:after="80"/>
-      </w:pPr>
-      <w:r>
-        <w:t xml:space="preserve">Manager dashboard with live bar and pie charts (JFreeChart) — manager-to-employee counts, breakdown of payment types, and orders categorized by Cash, Credit, and Takeaway.</w:t>
-      </w:r>
-    </w:p>
-    <w:p>
-      <w:pPr>
-        <w:pStyle w:val="ListParagraph"/>
-        <w:numPr>
-          <w:ilvl w:val="0"/>
-          <w:numId w:val="2"/>
-        </w:numPr>
-        <w:spacing w:after="80"/>
-      </w:pPr>
-      <w:r>
-        <w:t xml:space="preserve">Staff record management from the dashboard: add, update, and delete person records.</w:t>
-      </w:r>
-    </w:p>
-    <w:p>
-      <w:pPr>
-        <w:pStyle w:val="ListParagraph"/>
-        <w:numPr>
-          <w:ilvl w:val="0"/>
-          <w:numId w:val="2"/>
-        </w:numPr>
-        <w:spacing w:after="80"/>
-      </w:pPr>
-      <w:r>
-        <w:t xml:space="preserve">Menu browsing with item images and prices, and order building with selectable quantity.</w:t>
-      </w:r>
-    </w:p>
-    <w:p>
-      <w:pPr>
-        <w:pStyle w:val="ListParagraph"/>
-        <w:numPr>
-          <w:ilvl w:val="0"/>
-          <w:numId w:val="2"/>
-        </w:numPr>
-        <w:spacing w:after="80"/>
-      </w:pPr>
-      <w:r>
-        <w:t xml:space="preserve">Three payment paths per order: Cash, Credit Card, and Takeaway/Delivery.</w:t>
-      </w:r>
-    </w:p>
-    <w:p>
-      <w:pPr>
-        <w:pStyle w:val="ListParagraph"/>
-        <w:numPr>
-          <w:ilvl w:val="0"/>
-          <w:numId w:val="2"/>
-        </w:numPr>
-        <w:spacing w:after="80"/>
-      </w:pPr>
-      <w:r>
-        <w:t xml:space="preserve">Credit card payment capture — card number, name on card, expiry date — linked to the customer and the staff member who processed it.</w:t>
-      </w:r>
-    </w:p>
-    <w:p>
-      <w:pPr>
-        <w:pStyle w:val="ListParagraph"/>
-        <w:numPr>
-          <w:ilvl w:val="0"/>
-          <w:numId w:val="2"/>
-        </w:numPr>
-        <w:spacing w:after="80"/>
-      </w:pPr>
-      <w:r>
-        <w:t xml:space="preserve">Takeaway/delivery handling — customer name, address, phone, delivery fee, and amount due.</w:t>
-      </w:r>
-    </w:p>
-    <w:p>
-      <w:pPr>
-        <w:pStyle w:val="Heading2"/>
-        <w:spacing w:after="150" w:before="300"/>
-      </w:pPr>
-      <w:bookmarkStart w:name="bm_5" w:id="5"/>
+        <w:jc w:val="left"/>
+      </w:pPr>
       <w:r>
         <w:t xml:space="preserve">2.2 User Roles</w:t>
       </w:r>
-      <w:bookmarkEnd w:id="5"/>
     </w:p>
     <w:tbl>
       <w:tblPr>
@@ -778,6 +403,10 @@
             <w:vAlign w:val="center"/>
           </w:tcPr>
           <w:p>
+            <w:pPr>
+              <w:bidi w:val="false"/>
+              <w:jc w:val="left"/>
+            </w:pPr>
             <w:r>
               <w:rPr>
                 <w:b/>
@@ -801,6 +430,10 @@
             <w:vAlign w:val="center"/>
           </w:tcPr>
           <w:p>
+            <w:pPr>
+              <w:bidi w:val="false"/>
+              <w:jc w:val="left"/>
+            </w:pPr>
             <w:r>
               <w:rPr>
                 <w:b/>
@@ -824,6 +457,10 @@
             <w:vAlign w:val="center"/>
           </w:tcPr>
           <w:p>
+            <w:pPr>
+              <w:bidi w:val="false"/>
+              <w:jc w:val="left"/>
+            </w:pPr>
             <w:r>
               <w:rPr>
                 <w:b/>
@@ -848,6 +485,10 @@
             <w:vAlign w:val="center"/>
           </w:tcPr>
           <w:p>
+            <w:pPr>
+              <w:bidi w:val="false"/>
+              <w:jc w:val="left"/>
+            </w:pPr>
             <w:r>
               <w:rPr>
                 <w:b w:val="false"/>
@@ -870,6 +511,10 @@
             <w:vAlign w:val="center"/>
           </w:tcPr>
           <w:p>
+            <w:pPr>
+              <w:bidi w:val="false"/>
+              <w:jc w:val="left"/>
+            </w:pPr>
             <w:r>
               <w:rPr>
                 <w:b w:val="false"/>
@@ -892,6 +537,10 @@
             <w:vAlign w:val="center"/>
           </w:tcPr>
           <w:p>
+            <w:pPr>
+              <w:bidi w:val="false"/>
+              <w:jc w:val="left"/>
+            </w:pPr>
             <w:r>
               <w:rPr>
                 <w:b w:val="false"/>
@@ -916,6 +565,10 @@
             <w:vAlign w:val="center"/>
           </w:tcPr>
           <w:p>
+            <w:pPr>
+              <w:bidi w:val="false"/>
+              <w:jc w:val="left"/>
+            </w:pPr>
             <w:r>
               <w:rPr>
                 <w:b w:val="false"/>
@@ -938,6 +591,10 @@
             <w:vAlign w:val="center"/>
           </w:tcPr>
           <w:p>
+            <w:pPr>
+              <w:bidi w:val="false"/>
+              <w:jc w:val="left"/>
+            </w:pPr>
             <w:r>
               <w:rPr>
                 <w:b w:val="false"/>
@@ -960,6 +617,10 @@
             <w:vAlign w:val="center"/>
           </w:tcPr>
           <w:p>
+            <w:pPr>
+              <w:bidi w:val="false"/>
+              <w:jc w:val="left"/>
+            </w:pPr>
             <w:r>
               <w:rPr>
                 <w:b w:val="false"/>
@@ -975,32 +636,34 @@
     <w:p>
       <w:pPr>
         <w:pStyle w:val="Heading1"/>
+        <w:bidi w:val="false"/>
         <w:spacing w:after="200" w:before="400"/>
-      </w:pPr>
-      <w:bookmarkStart w:name="bm_6" w:id="6"/>
+        <w:jc w:val="left"/>
+      </w:pPr>
       <w:r>
         <w:t xml:space="preserve">3. Architecture and Design</w:t>
       </w:r>
-      <w:bookmarkEnd w:id="6"/>
-    </w:p>
-    <w:p>
-      <w:pPr>
+    </w:p>
+    <w:p>
+      <w:pPr>
+        <w:bidi w:val="false"/>
         <w:spacing w:after="150"/>
-      </w:pPr>
-      <w:r>
-        <w:t xml:space="preserve">The application follows a straightforward layered structure typical of a small Swing/JDBC desktop project: Swing JFrame subclasses act as both the view and controller for each screen, and a single connection-holder class centralizes access to the database. There is no separate persistence or service layer — each screen issues its own SQL through JDBC — which keeps the project simple and traceable for a course assignment of this scope.</w:t>
+        <w:jc w:val="left"/>
+      </w:pPr>
+      <w:r>
+        <w:t xml:space="preserve">The application follows a straightforward layered structure typical of a small Swing/JDBC desktop project. Swing JFrame subclasses act as both the view and controller for each screen, and a single connection-holder class centralizes access to the database. There is no separate persistence or service layer; each screen issues its own SQL through JDBC, which keeps the project simple and traceable for a course assignment of this scope.</w:t>
       </w:r>
     </w:p>
     <w:p>
       <w:pPr>
         <w:pStyle w:val="Heading2"/>
+        <w:bidi w:val="false"/>
         <w:spacing w:after="150" w:before="300"/>
-      </w:pPr>
-      <w:bookmarkStart w:name="bm_7" w:id="7"/>
+        <w:jc w:val="left"/>
+      </w:pPr>
       <w:r>
         <w:t xml:space="preserve">3.1 Class Overview</w:t>
       </w:r>
-      <w:bookmarkEnd w:id="7"/>
     </w:p>
     <w:tbl>
       <w:tblPr>
@@ -1032,6 +695,10 @@
             <w:vAlign w:val="center"/>
           </w:tcPr>
           <w:p>
+            <w:pPr>
+              <w:bidi w:val="false"/>
+              <w:jc w:val="left"/>
+            </w:pPr>
             <w:r>
               <w:rPr>
                 <w:b/>
@@ -1055,6 +722,10 @@
             <w:vAlign w:val="center"/>
           </w:tcPr>
           <w:p>
+            <w:pPr>
+              <w:bidi w:val="false"/>
+              <w:jc w:val="left"/>
+            </w:pPr>
             <w:r>
               <w:rPr>
                 <w:b/>
@@ -1079,6 +750,10 @@
             <w:vAlign w:val="center"/>
           </w:tcPr>
           <w:p>
+            <w:pPr>
+              <w:bidi w:val="false"/>
+              <w:jc w:val="left"/>
+            </w:pPr>
             <w:r>
               <w:rPr>
                 <w:b w:val="false"/>
@@ -1101,6 +776,10 @@
             <w:vAlign w:val="center"/>
           </w:tcPr>
           <w:p>
+            <w:pPr>
+              <w:bidi w:val="false"/>
+              <w:jc w:val="left"/>
+            </w:pPr>
             <w:r>
               <w:rPr>
                 <w:b w:val="false"/>
@@ -1125,6 +804,10 @@
             <w:vAlign w:val="center"/>
           </w:tcPr>
           <w:p>
+            <w:pPr>
+              <w:bidi w:val="false"/>
+              <w:jc w:val="left"/>
+            </w:pPr>
             <w:r>
               <w:rPr>
                 <w:b w:val="false"/>
@@ -1147,6 +830,10 @@
             <w:vAlign w:val="center"/>
           </w:tcPr>
           <w:p>
+            <w:pPr>
+              <w:bidi w:val="false"/>
+              <w:jc w:val="left"/>
+            </w:pPr>
             <w:r>
               <w:rPr>
                 <w:b w:val="false"/>
@@ -1171,6 +858,10 @@
             <w:vAlign w:val="center"/>
           </w:tcPr>
           <w:p>
+            <w:pPr>
+              <w:bidi w:val="false"/>
+              <w:jc w:val="left"/>
+            </w:pPr>
             <w:r>
               <w:rPr>
                 <w:b w:val="false"/>
@@ -1193,6 +884,10 @@
             <w:vAlign w:val="center"/>
           </w:tcPr>
           <w:p>
+            <w:pPr>
+              <w:bidi w:val="false"/>
+              <w:jc w:val="left"/>
+            </w:pPr>
             <w:r>
               <w:rPr>
                 <w:b w:val="false"/>
@@ -1217,6 +912,10 @@
             <w:vAlign w:val="center"/>
           </w:tcPr>
           <w:p>
+            <w:pPr>
+              <w:bidi w:val="false"/>
+              <w:jc w:val="left"/>
+            </w:pPr>
             <w:r>
               <w:rPr>
                 <w:b w:val="false"/>
@@ -1239,6 +938,10 @@
             <w:vAlign w:val="center"/>
           </w:tcPr>
           <w:p>
+            <w:pPr>
+              <w:bidi w:val="false"/>
+              <w:jc w:val="left"/>
+            </w:pPr>
             <w:r>
               <w:rPr>
                 <w:b w:val="false"/>
@@ -1263,6 +966,10 @@
             <w:vAlign w:val="center"/>
           </w:tcPr>
           <w:p>
+            <w:pPr>
+              <w:bidi w:val="false"/>
+              <w:jc w:val="left"/>
+            </w:pPr>
             <w:r>
               <w:rPr>
                 <w:b w:val="false"/>
@@ -1285,6 +992,10 @@
             <w:vAlign w:val="center"/>
           </w:tcPr>
           <w:p>
+            <w:pPr>
+              <w:bidi w:val="false"/>
+              <w:jc w:val="left"/>
+            </w:pPr>
             <w:r>
               <w:rPr>
                 <w:b w:val="false"/>
@@ -1309,6 +1020,10 @@
             <w:vAlign w:val="center"/>
           </w:tcPr>
           <w:p>
+            <w:pPr>
+              <w:bidi w:val="false"/>
+              <w:jc w:val="left"/>
+            </w:pPr>
             <w:r>
               <w:rPr>
                 <w:b w:val="false"/>
@@ -1331,6 +1046,10 @@
             <w:vAlign w:val="center"/>
           </w:tcPr>
           <w:p>
+            <w:pPr>
+              <w:bidi w:val="false"/>
+              <w:jc w:val="left"/>
+            </w:pPr>
             <w:r>
               <w:rPr>
                 <w:b w:val="false"/>
@@ -1355,6 +1074,10 @@
             <w:vAlign w:val="center"/>
           </w:tcPr>
           <w:p>
+            <w:pPr>
+              <w:bidi w:val="false"/>
+              <w:jc w:val="left"/>
+            </w:pPr>
             <w:r>
               <w:rPr>
                 <w:b w:val="false"/>
@@ -1377,6 +1100,10 @@
             <w:vAlign w:val="center"/>
           </w:tcPr>
           <w:p>
+            <w:pPr>
+              <w:bidi w:val="false"/>
+              <w:jc w:val="left"/>
+            </w:pPr>
             <w:r>
               <w:rPr>
                 <w:b w:val="false"/>
@@ -1401,6 +1128,10 @@
             <w:vAlign w:val="center"/>
           </w:tcPr>
           <w:p>
+            <w:pPr>
+              <w:bidi w:val="false"/>
+              <w:jc w:val="left"/>
+            </w:pPr>
             <w:r>
               <w:rPr>
                 <w:b w:val="false"/>
@@ -1423,6 +1154,10 @@
             <w:vAlign w:val="center"/>
           </w:tcPr>
           <w:p>
+            <w:pPr>
+              <w:bidi w:val="false"/>
+              <w:jc w:val="left"/>
+            </w:pPr>
             <w:r>
               <w:rPr>
                 <w:b w:val="false"/>
@@ -1447,6 +1182,10 @@
             <w:vAlign w:val="center"/>
           </w:tcPr>
           <w:p>
+            <w:pPr>
+              <w:bidi w:val="false"/>
+              <w:jc w:val="left"/>
+            </w:pPr>
             <w:r>
               <w:rPr>
                 <w:b w:val="false"/>
@@ -1469,6 +1208,10 @@
             <w:vAlign w:val="center"/>
           </w:tcPr>
           <w:p>
+            <w:pPr>
+              <w:bidi w:val="false"/>
+              <w:jc w:val="left"/>
+            </w:pPr>
             <w:r>
               <w:rPr>
                 <w:b w:val="false"/>
@@ -1484,85 +1227,95 @@
     <w:p>
       <w:pPr>
         <w:pStyle w:val="Heading2"/>
+        <w:bidi w:val="false"/>
         <w:spacing w:after="150" w:before="300"/>
-      </w:pPr>
-      <w:bookmarkStart w:name="bm_8" w:id="8"/>
+        <w:jc w:val="left"/>
+      </w:pPr>
       <w:r>
         <w:t xml:space="preserve">3.2 Object-Oriented Concepts Applied</w:t>
       </w:r>
-      <w:bookmarkEnd w:id="8"/>
-    </w:p>
-    <w:p>
-      <w:pPr>
-        <w:pStyle w:val="ListParagraph"/>
-        <w:numPr>
-          <w:ilvl w:val="0"/>
-          <w:numId w:val="2"/>
-        </w:numPr>
-        <w:spacing w:after="80"/>
-      </w:pPr>
-      <w:r>
-        <w:t xml:space="preserve">Encapsulation — data-holder classes such as PersonClass group related fields together, and SessionPerson exposes controlled static accessors instead of raw shared state.</w:t>
-      </w:r>
-    </w:p>
-    <w:p>
-      <w:pPr>
-        <w:pStyle w:val="ListParagraph"/>
-        <w:numPr>
-          <w:ilvl w:val="0"/>
-          <w:numId w:val="2"/>
-        </w:numPr>
-        <w:spacing w:after="80"/>
-      </w:pPr>
-      <w:r>
-        <w:t xml:space="preserve">Inheritance — every screen (LoginFrame, Dash2, Menu, DeliveryForm, CreditForm) extends javax.swing.JFrame, inheriting windowing behavior while specializing its own layout and logic.</w:t>
-      </w:r>
-    </w:p>
-    <w:p>
-      <w:pPr>
-        <w:pStyle w:val="ListParagraph"/>
-        <w:numPr>
-          <w:ilvl w:val="0"/>
-          <w:numId w:val="2"/>
-        </w:numPr>
-        <w:spacing w:after="80"/>
-      </w:pPr>
-      <w:r>
-        <w:t xml:space="preserve">Single responsibility per class — connection handling, session state, and each screen's UI/logic are kept in separate classes rather than one monolithic class.</w:t>
-      </w:r>
-    </w:p>
-    <w:p>
-      <w:pPr>
-        <w:pStyle w:val="ListParagraph"/>
-        <w:numPr>
-          <w:ilvl w:val="0"/>
-          <w:numId w:val="2"/>
-        </w:numPr>
-        <w:spacing w:after="80"/>
-      </w:pPr>
-      <w:r>
-        <w:t xml:space="preserve">Event-driven design — Swing's listener model (ActionListener callbacks on buttons/menus) drives control flow between screens, e.g. LoginFrame constructing and showing Dash2 or Menu on successful login.</w:t>
+    </w:p>
+    <w:p>
+      <w:pPr>
+        <w:pStyle w:val="ListParagraph"/>
+        <w:numPr>
+          <w:ilvl w:val="0"/>
+          <w:numId w:val="2"/>
+        </w:numPr>
+        <w:bidi w:val="false"/>
+        <w:spacing w:after="80"/>
+        <w:jc w:val="left"/>
+      </w:pPr>
+      <w:r>
+        <w:t xml:space="preserve">Encapsulation: data-holder classes such as PersonClass group related fields together, and SessionPerson exposes controlled static accessors instead of raw shared state.</w:t>
+      </w:r>
+    </w:p>
+    <w:p>
+      <w:pPr>
+        <w:pStyle w:val="ListParagraph"/>
+        <w:numPr>
+          <w:ilvl w:val="0"/>
+          <w:numId w:val="2"/>
+        </w:numPr>
+        <w:bidi w:val="false"/>
+        <w:spacing w:after="80"/>
+        <w:jc w:val="left"/>
+      </w:pPr>
+      <w:r>
+        <w:t xml:space="preserve">Inheritance: every screen (LoginFrame, Dash2, Menu, DeliveryForm, CreditForm) extends javax.swing.JFrame, inheriting windowing behavior while specializing its own layout and logic.</w:t>
+      </w:r>
+    </w:p>
+    <w:p>
+      <w:pPr>
+        <w:pStyle w:val="ListParagraph"/>
+        <w:numPr>
+          <w:ilvl w:val="0"/>
+          <w:numId w:val="2"/>
+        </w:numPr>
+        <w:bidi w:val="false"/>
+        <w:spacing w:after="80"/>
+        <w:jc w:val="left"/>
+      </w:pPr>
+      <w:r>
+        <w:t xml:space="preserve">Single responsibility per class: connection handling, session state, and each screen's UI/logic are kept in separate classes rather than one monolithic class.</w:t>
+      </w:r>
+    </w:p>
+    <w:p>
+      <w:pPr>
+        <w:pStyle w:val="ListParagraph"/>
+        <w:numPr>
+          <w:ilvl w:val="0"/>
+          <w:numId w:val="2"/>
+        </w:numPr>
+        <w:bidi w:val="false"/>
+        <w:spacing w:after="80"/>
+        <w:jc w:val="left"/>
+      </w:pPr>
+      <w:r>
+        <w:t xml:space="preserve">Event-driven design: Swing's listener model (ActionListener callbacks on buttons/menus) drives control flow between screens, e.g. LoginFrame constructing and showing Dash2 or Menu on successful login.</w:t>
       </w:r>
     </w:p>
     <w:p>
       <w:pPr>
         <w:pStyle w:val="Heading2"/>
+        <w:bidi w:val="false"/>
         <w:spacing w:after="150" w:before="300"/>
-      </w:pPr>
-      <w:bookmarkStart w:name="bm_9" w:id="9"/>
+        <w:jc w:val="left"/>
+      </w:pPr>
       <w:r>
         <w:t xml:space="preserve">3.3 Application Flow</w:t>
       </w:r>
-      <w:bookmarkEnd w:id="9"/>
-    </w:p>
-    <w:p>
-      <w:pPr>
-        <w:pStyle w:val="ListParagraph"/>
-        <w:numPr>
-          <w:ilvl w:val="0"/>
-          <w:numId w:val="2"/>
-        </w:numPr>
-        <w:spacing w:after="80"/>
+    </w:p>
+    <w:p>
+      <w:pPr>
+        <w:pStyle w:val="ListParagraph"/>
+        <w:numPr>
+          <w:ilvl w:val="0"/>
+          <w:numId w:val="2"/>
+        </w:numPr>
+        <w:bidi w:val="false"/>
+        <w:spacing w:after="80"/>
+        <w:jc w:val="left"/>
       </w:pPr>
       <w:r>
         <w:t xml:space="preserve">1. ALDIWAN.main() starts the application and opens LoginFrame.</w:t>
@@ -1575,7 +1328,9 @@
           <w:ilvl w:val="0"/>
           <w:numId w:val="2"/>
         </w:numPr>
-        <w:spacing w:after="80"/>
+        <w:bidi w:val="false"/>
+        <w:spacing w:after="80"/>
+        <w:jc w:val="left"/>
       </w:pPr>
       <w:r>
         <w:t xml:space="preserve">2. LoginFrame validates the entered username/password against the person table.</w:t>
@@ -1588,7 +1343,9 @@
           <w:ilvl w:val="0"/>
           <w:numId w:val="2"/>
         </w:numPr>
-        <w:spacing w:after="80"/>
+        <w:bidi w:val="false"/>
+        <w:spacing w:after="80"/>
+        <w:jc w:val="left"/>
       </w:pPr>
       <w:r>
         <w:t xml:space="preserve">3. On success, the person's role determines the next screen: Dash2 for 'manager', Menu for 'user'.</w:t>
@@ -1601,20 +1358,24 @@
           <w:ilvl w:val="0"/>
           <w:numId w:val="2"/>
         </w:numPr>
-        <w:spacing w:after="80"/>
-      </w:pPr>
-      <w:r>
-        <w:t xml:space="preserve">4. From Menu, staff build an order and choose Cash, Credit (→ CreditForm), or Takeaway (→ DeliveryForm).</w:t>
-      </w:r>
-    </w:p>
-    <w:p>
-      <w:pPr>
-        <w:pStyle w:val="ListParagraph"/>
-        <w:numPr>
-          <w:ilvl w:val="0"/>
-          <w:numId w:val="2"/>
-        </w:numPr>
-        <w:spacing w:after="80"/>
+        <w:bidi w:val="false"/>
+        <w:spacing w:after="80"/>
+        <w:jc w:val="left"/>
+      </w:pPr>
+      <w:r>
+        <w:t xml:space="preserve">4. From Menu, staff build an order and choose Cash, Credit (goes to CreditForm), or Takeaway (goes to DeliveryForm).</w:t>
+      </w:r>
+    </w:p>
+    <w:p>
+      <w:pPr>
+        <w:pStyle w:val="ListParagraph"/>
+        <w:numPr>
+          <w:ilvl w:val="0"/>
+          <w:numId w:val="2"/>
+        </w:numPr>
+        <w:bidi w:val="false"/>
+        <w:spacing w:after="80"/>
+        <w:jc w:val="left"/>
       </w:pPr>
       <w:r>
         <w:t xml:space="preserve">5. Order, payment, and delivery details are persisted to the corresponding MySQL tables.</w:t>
@@ -1623,17 +1384,19 @@
     <w:p>
       <w:pPr>
         <w:pStyle w:val="Heading1"/>
+        <w:bidi w:val="false"/>
         <w:spacing w:after="200" w:before="400"/>
-      </w:pPr>
-      <w:bookmarkStart w:name="bm_10" w:id="10"/>
+        <w:jc w:val="left"/>
+      </w:pPr>
       <w:r>
         <w:t xml:space="preserve">4. Database Design</w:t>
       </w:r>
-      <w:bookmarkEnd w:id="10"/>
-    </w:p>
-    <w:p>
-      <w:pPr>
+    </w:p>
+    <w:p>
+      <w:pPr>
+        <w:bidi w:val="false"/>
         <w:spacing w:after="150"/>
+        <w:jc w:val="left"/>
       </w:pPr>
       <w:r>
         <w:t xml:space="preserve">The database, aldiwandb, is a MySQL schema with six tables covering staff, customers, the menu, orders, credit payments, and takeaway deliveries. The schema and seed data are provided in ALDIWAN6/aldiwandb.sql.</w:t>
@@ -1642,13 +1405,13 @@
     <w:p>
       <w:pPr>
         <w:pStyle w:val="Heading2"/>
+        <w:bidi w:val="false"/>
         <w:spacing w:after="150" w:before="300"/>
-      </w:pPr>
-      <w:bookmarkStart w:name="bm_11" w:id="11"/>
+        <w:jc w:val="left"/>
+      </w:pPr>
       <w:r>
         <w:t xml:space="preserve">4.1 Tables</w:t>
       </w:r>
-      <w:bookmarkEnd w:id="11"/>
     </w:p>
     <w:tbl>
       <w:tblPr>
@@ -1681,6 +1444,10 @@
             <w:vAlign w:val="center"/>
           </w:tcPr>
           <w:p>
+            <w:pPr>
+              <w:bidi w:val="false"/>
+              <w:jc w:val="left"/>
+            </w:pPr>
             <w:r>
               <w:rPr>
                 <w:b/>
@@ -1704,6 +1471,10 @@
             <w:vAlign w:val="center"/>
           </w:tcPr>
           <w:p>
+            <w:pPr>
+              <w:bidi w:val="false"/>
+              <w:jc w:val="left"/>
+            </w:pPr>
             <w:r>
               <w:rPr>
                 <w:b/>
@@ -1727,6 +1498,10 @@
             <w:vAlign w:val="center"/>
           </w:tcPr>
           <w:p>
+            <w:pPr>
+              <w:bidi w:val="false"/>
+              <w:jc w:val="left"/>
+            </w:pPr>
             <w:r>
               <w:rPr>
                 <w:b/>
@@ -1751,6 +1526,10 @@
             <w:vAlign w:val="center"/>
           </w:tcPr>
           <w:p>
+            <w:pPr>
+              <w:bidi w:val="false"/>
+              <w:jc w:val="left"/>
+            </w:pPr>
             <w:r>
               <w:rPr>
                 <w:b w:val="false"/>
@@ -1773,6 +1552,10 @@
             <w:vAlign w:val="center"/>
           </w:tcPr>
           <w:p>
+            <w:pPr>
+              <w:bidi w:val="false"/>
+              <w:jc w:val="left"/>
+            </w:pPr>
             <w:r>
               <w:rPr>
                 <w:b w:val="false"/>
@@ -1795,6 +1578,10 @@
             <w:vAlign w:val="center"/>
           </w:tcPr>
           <w:p>
+            <w:pPr>
+              <w:bidi w:val="false"/>
+              <w:jc w:val="left"/>
+            </w:pPr>
             <w:r>
               <w:rPr>
                 <w:b w:val="false"/>
@@ -1819,6 +1606,10 @@
             <w:vAlign w:val="center"/>
           </w:tcPr>
           <w:p>
+            <w:pPr>
+              <w:bidi w:val="false"/>
+              <w:jc w:val="left"/>
+            </w:pPr>
             <w:r>
               <w:rPr>
                 <w:b w:val="false"/>
@@ -1841,6 +1632,10 @@
             <w:vAlign w:val="center"/>
           </w:tcPr>
           <w:p>
+            <w:pPr>
+              <w:bidi w:val="false"/>
+              <w:jc w:val="left"/>
+            </w:pPr>
             <w:r>
               <w:rPr>
                 <w:b w:val="false"/>
@@ -1863,6 +1658,10 @@
             <w:vAlign w:val="center"/>
           </w:tcPr>
           <w:p>
+            <w:pPr>
+              <w:bidi w:val="false"/>
+              <w:jc w:val="left"/>
+            </w:pPr>
             <w:r>
               <w:rPr>
                 <w:b w:val="false"/>
@@ -1887,6 +1686,10 @@
             <w:vAlign w:val="center"/>
           </w:tcPr>
           <w:p>
+            <w:pPr>
+              <w:bidi w:val="false"/>
+              <w:jc w:val="left"/>
+            </w:pPr>
             <w:r>
               <w:rPr>
                 <w:b w:val="false"/>
@@ -1909,6 +1712,10 @@
             <w:vAlign w:val="center"/>
           </w:tcPr>
           <w:p>
+            <w:pPr>
+              <w:bidi w:val="false"/>
+              <w:jc w:val="left"/>
+            </w:pPr>
             <w:r>
               <w:rPr>
                 <w:b w:val="false"/>
@@ -1931,6 +1738,10 @@
             <w:vAlign w:val="center"/>
           </w:tcPr>
           <w:p>
+            <w:pPr>
+              <w:bidi w:val="false"/>
+              <w:jc w:val="left"/>
+            </w:pPr>
             <w:r>
               <w:rPr>
                 <w:b w:val="false"/>
@@ -1955,6 +1766,10 @@
             <w:vAlign w:val="center"/>
           </w:tcPr>
           <w:p>
+            <w:pPr>
+              <w:bidi w:val="false"/>
+              <w:jc w:val="left"/>
+            </w:pPr>
             <w:r>
               <w:rPr>
                 <w:b w:val="false"/>
@@ -1977,6 +1792,10 @@
             <w:vAlign w:val="center"/>
           </w:tcPr>
           <w:p>
+            <w:pPr>
+              <w:bidi w:val="false"/>
+              <w:jc w:val="left"/>
+            </w:pPr>
             <w:r>
               <w:rPr>
                 <w:b w:val="false"/>
@@ -1999,6 +1818,10 @@
             <w:vAlign w:val="center"/>
           </w:tcPr>
           <w:p>
+            <w:pPr>
+              <w:bidi w:val="false"/>
+              <w:jc w:val="left"/>
+            </w:pPr>
             <w:r>
               <w:rPr>
                 <w:b w:val="false"/>
@@ -2023,6 +1846,10 @@
             <w:vAlign w:val="center"/>
           </w:tcPr>
           <w:p>
+            <w:pPr>
+              <w:bidi w:val="false"/>
+              <w:jc w:val="left"/>
+            </w:pPr>
             <w:r>
               <w:rPr>
                 <w:b w:val="false"/>
@@ -2045,6 +1872,10 @@
             <w:vAlign w:val="center"/>
           </w:tcPr>
           <w:p>
+            <w:pPr>
+              <w:bidi w:val="false"/>
+              <w:jc w:val="left"/>
+            </w:pPr>
             <w:r>
               <w:rPr>
                 <w:b w:val="false"/>
@@ -2067,6 +1898,10 @@
             <w:vAlign w:val="center"/>
           </w:tcPr>
           <w:p>
+            <w:pPr>
+              <w:bidi w:val="false"/>
+              <w:jc w:val="left"/>
+            </w:pPr>
             <w:r>
               <w:rPr>
                 <w:b w:val="false"/>
@@ -2091,6 +1926,10 @@
             <w:vAlign w:val="center"/>
           </w:tcPr>
           <w:p>
+            <w:pPr>
+              <w:bidi w:val="false"/>
+              <w:jc w:val="left"/>
+            </w:pPr>
             <w:r>
               <w:rPr>
                 <w:b w:val="false"/>
@@ -2113,6 +1952,10 @@
             <w:vAlign w:val="center"/>
           </w:tcPr>
           <w:p>
+            <w:pPr>
+              <w:bidi w:val="false"/>
+              <w:jc w:val="left"/>
+            </w:pPr>
             <w:r>
               <w:rPr>
                 <w:b w:val="false"/>
@@ -2135,6 +1978,10 @@
             <w:vAlign w:val="center"/>
           </w:tcPr>
           <w:p>
+            <w:pPr>
+              <w:bidi w:val="false"/>
+              <w:jc w:val="left"/>
+            </w:pPr>
             <w:r>
               <w:rPr>
                 <w:b w:val="false"/>
@@ -2150,22 +1997,24 @@
     <w:p>
       <w:pPr>
         <w:pStyle w:val="Heading2"/>
+        <w:bidi w:val="false"/>
         <w:spacing w:after="150" w:before="300"/>
-      </w:pPr>
-      <w:bookmarkStart w:name="bm_12" w:id="12"/>
+        <w:jc w:val="left"/>
+      </w:pPr>
       <w:r>
         <w:t xml:space="preserve">4.2 Relationships</w:t>
       </w:r>
-      <w:bookmarkEnd w:id="12"/>
-    </w:p>
-    <w:p>
-      <w:pPr>
-        <w:pStyle w:val="ListParagraph"/>
-        <w:numPr>
-          <w:ilvl w:val="0"/>
-          <w:numId w:val="2"/>
-        </w:numPr>
-        <w:spacing w:after="80"/>
+    </w:p>
+    <w:p>
+      <w:pPr>
+        <w:pStyle w:val="ListParagraph"/>
+        <w:numPr>
+          <w:ilvl w:val="0"/>
+          <w:numId w:val="2"/>
+        </w:numPr>
+        <w:bidi w:val="false"/>
+        <w:spacing w:after="80"/>
+        <w:jc w:val="left"/>
       </w:pPr>
       <w:r>
         <w:t xml:space="preserve">orders.user_id references a staff member in person; orders.item_id references menu_items.</w:t>
@@ -2178,7 +2027,9 @@
           <w:ilvl w:val="0"/>
           <w:numId w:val="2"/>
         </w:numPr>
-        <w:spacing w:after="80"/>
+        <w:bidi w:val="false"/>
+        <w:spacing w:after="80"/>
+        <w:jc w:val="left"/>
       </w:pPr>
       <w:r>
         <w:t xml:space="preserve">paycredit.customer_id references customer; paycredit.person_id references the staff member (person) who took the payment.</w:t>
@@ -2191,7 +2042,9 @@
           <w:ilvl w:val="0"/>
           <w:numId w:val="2"/>
         </w:numPr>
-        <w:spacing w:after="80"/>
+        <w:bidi w:val="false"/>
+        <w:spacing w:after="80"/>
+        <w:jc w:val="left"/>
       </w:pPr>
       <w:r>
         <w:t xml:space="preserve">takeaway.order_id references orders; takeaway.customer_id references customer.</w:t>
@@ -2200,13 +2053,13 @@
     <w:p>
       <w:pPr>
         <w:pStyle w:val="Heading1"/>
+        <w:bidi w:val="false"/>
         <w:spacing w:after="200" w:before="400"/>
-      </w:pPr>
-      <w:bookmarkStart w:name="bm_13" w:id="13"/>
+        <w:jc w:val="left"/>
+      </w:pPr>
       <w:r>
         <w:t xml:space="preserve">5. Technology Stack</w:t>
       </w:r>
-      <w:bookmarkEnd w:id="13"/>
     </w:p>
     <w:tbl>
       <w:tblPr>
@@ -2238,6 +2091,10 @@
             <w:vAlign w:val="center"/>
           </w:tcPr>
           <w:p>
+            <w:pPr>
+              <w:bidi w:val="false"/>
+              <w:jc w:val="left"/>
+            </w:pPr>
             <w:r>
               <w:rPr>
                 <w:b/>
@@ -2261,6 +2118,10 @@
             <w:vAlign w:val="center"/>
           </w:tcPr>
           <w:p>
+            <w:pPr>
+              <w:bidi w:val="false"/>
+              <w:jc w:val="left"/>
+            </w:pPr>
             <w:r>
               <w:rPr>
                 <w:b/>
@@ -2285,6 +2146,10 @@
             <w:vAlign w:val="center"/>
           </w:tcPr>
           <w:p>
+            <w:pPr>
+              <w:bidi w:val="false"/>
+              <w:jc w:val="left"/>
+            </w:pPr>
             <w:r>
               <w:rPr>
                 <w:b w:val="false"/>
@@ -2307,6 +2172,10 @@
             <w:vAlign w:val="center"/>
           </w:tcPr>
           <w:p>
+            <w:pPr>
+              <w:bidi w:val="false"/>
+              <w:jc w:val="left"/>
+            </w:pPr>
             <w:r>
               <w:rPr>
                 <w:b w:val="false"/>
@@ -2331,6 +2200,10 @@
             <w:vAlign w:val="center"/>
           </w:tcPr>
           <w:p>
+            <w:pPr>
+              <w:bidi w:val="false"/>
+              <w:jc w:val="left"/>
+            </w:pPr>
             <w:r>
               <w:rPr>
                 <w:b w:val="false"/>
@@ -2353,6 +2226,10 @@
             <w:vAlign w:val="center"/>
           </w:tcPr>
           <w:p>
+            <w:pPr>
+              <w:bidi w:val="false"/>
+              <w:jc w:val="left"/>
+            </w:pPr>
             <w:r>
               <w:rPr>
                 <w:b w:val="false"/>
@@ -2377,6 +2254,10 @@
             <w:vAlign w:val="center"/>
           </w:tcPr>
           <w:p>
+            <w:pPr>
+              <w:bidi w:val="false"/>
+              <w:jc w:val="left"/>
+            </w:pPr>
             <w:r>
               <w:rPr>
                 <w:b w:val="false"/>
@@ -2399,6 +2280,10 @@
             <w:vAlign w:val="center"/>
           </w:tcPr>
           <w:p>
+            <w:pPr>
+              <w:bidi w:val="false"/>
+              <w:jc w:val="left"/>
+            </w:pPr>
             <w:r>
               <w:rPr>
                 <w:b w:val="false"/>
@@ -2423,6 +2308,10 @@
             <w:vAlign w:val="center"/>
           </w:tcPr>
           <w:p>
+            <w:pPr>
+              <w:bidi w:val="false"/>
+              <w:jc w:val="left"/>
+            </w:pPr>
             <w:r>
               <w:rPr>
                 <w:b w:val="false"/>
@@ -2445,6 +2334,10 @@
             <w:vAlign w:val="center"/>
           </w:tcPr>
           <w:p>
+            <w:pPr>
+              <w:bidi w:val="false"/>
+              <w:jc w:val="left"/>
+            </w:pPr>
             <w:r>
               <w:rPr>
                 <w:b w:val="false"/>
@@ -2469,6 +2362,10 @@
             <w:vAlign w:val="center"/>
           </w:tcPr>
           <w:p>
+            <w:pPr>
+              <w:bidi w:val="false"/>
+              <w:jc w:val="left"/>
+            </w:pPr>
             <w:r>
               <w:rPr>
                 <w:b w:val="false"/>
@@ -2491,6 +2388,10 @@
             <w:vAlign w:val="center"/>
           </w:tcPr>
           <w:p>
+            <w:pPr>
+              <w:bidi w:val="false"/>
+              <w:jc w:val="left"/>
+            </w:pPr>
             <w:r>
               <w:rPr>
                 <w:b w:val="false"/>
@@ -2515,6 +2416,10 @@
             <w:vAlign w:val="center"/>
           </w:tcPr>
           <w:p>
+            <w:pPr>
+              <w:bidi w:val="false"/>
+              <w:jc w:val="left"/>
+            </w:pPr>
             <w:r>
               <w:rPr>
                 <w:b w:val="false"/>
@@ -2537,6 +2442,10 @@
             <w:vAlign w:val="center"/>
           </w:tcPr>
           <w:p>
+            <w:pPr>
+              <w:bidi w:val="false"/>
+              <w:jc w:val="left"/>
+            </w:pPr>
             <w:r>
               <w:rPr>
                 <w:b w:val="false"/>
@@ -2561,6 +2470,10 @@
             <w:vAlign w:val="center"/>
           </w:tcPr>
           <w:p>
+            <w:pPr>
+              <w:bidi w:val="false"/>
+              <w:jc w:val="left"/>
+            </w:pPr>
             <w:r>
               <w:rPr>
                 <w:b w:val="false"/>
@@ -2583,6 +2496,10 @@
             <w:vAlign w:val="center"/>
           </w:tcPr>
           <w:p>
+            <w:pPr>
+              <w:bidi w:val="false"/>
+              <w:jc w:val="left"/>
+            </w:pPr>
             <w:r>
               <w:rPr>
                 <w:b w:val="false"/>
@@ -2598,17 +2515,19 @@
     <w:p>
       <w:pPr>
         <w:pStyle w:val="Heading1"/>
+        <w:bidi w:val="false"/>
         <w:spacing w:after="200" w:before="400"/>
-      </w:pPr>
-      <w:bookmarkStart w:name="bm_14" w:id="14"/>
+        <w:jc w:val="left"/>
+      </w:pPr>
       <w:r>
         <w:t xml:space="preserve">6. Project Structure</w:t>
       </w:r>
-      <w:bookmarkEnd w:id="14"/>
-    </w:p>
-    <w:p>
-      <w:pPr>
+    </w:p>
+    <w:p>
+      <w:pPr>
+        <w:bidi w:val="false"/>
         <w:spacing w:after="150"/>
+        <w:jc w:val="left"/>
       </w:pPr>
       <w:r>
         <w:t xml:space="preserve">ALDIWAN6/</w:t>
@@ -2621,67 +2540,79 @@
           <w:ilvl w:val="0"/>
           <w:numId w:val="2"/>
         </w:numPr>
-        <w:spacing w:after="80"/>
-      </w:pPr>
-      <w:r>
-        <w:t xml:space="preserve">src/aldiwan/ — Java source and NetBeans .form files for every screen</w:t>
-      </w:r>
-    </w:p>
-    <w:p>
-      <w:pPr>
-        <w:pStyle w:val="ListParagraph"/>
-        <w:numPr>
-          <w:ilvl w:val="0"/>
-          <w:numId w:val="2"/>
-        </w:numPr>
-        <w:spacing w:after="80"/>
-      </w:pPr>
-      <w:r>
-        <w:t xml:space="preserve">Images/ and imagesSmall/ — menu item photography (full-size and thumbnail)</w:t>
-      </w:r>
-    </w:p>
-    <w:p>
-      <w:pPr>
-        <w:pStyle w:val="ListParagraph"/>
-        <w:numPr>
-          <w:ilvl w:val="0"/>
-          <w:numId w:val="2"/>
-        </w:numPr>
-        <w:spacing w:after="80"/>
-      </w:pPr>
-      <w:r>
-        <w:t xml:space="preserve">nbproject/ — NetBeans project configuration</w:t>
-      </w:r>
-    </w:p>
-    <w:p>
-      <w:pPr>
-        <w:pStyle w:val="ListParagraph"/>
-        <w:numPr>
-          <w:ilvl w:val="0"/>
-          <w:numId w:val="2"/>
-        </w:numPr>
-        <w:spacing w:after="80"/>
-      </w:pPr>
-      <w:r>
-        <w:t xml:space="preserve">aldiwandb.sql — MySQL schema and seed data</w:t>
-      </w:r>
-    </w:p>
-    <w:p>
-      <w:pPr>
-        <w:pStyle w:val="ListParagraph"/>
-        <w:numPr>
-          <w:ilvl w:val="0"/>
-          <w:numId w:val="2"/>
-        </w:numPr>
-        <w:spacing w:after="80"/>
-      </w:pPr>
-      <w:r>
-        <w:t xml:space="preserve">build.xml — Ant build script</w:t>
-      </w:r>
-    </w:p>
-    <w:p>
-      <w:pPr>
+        <w:bidi w:val="false"/>
+        <w:spacing w:after="80"/>
+        <w:jc w:val="left"/>
+      </w:pPr>
+      <w:r>
+        <w:t xml:space="preserve">src/aldiwan/: Java source and NetBeans .form files for every screen</w:t>
+      </w:r>
+    </w:p>
+    <w:p>
+      <w:pPr>
+        <w:pStyle w:val="ListParagraph"/>
+        <w:numPr>
+          <w:ilvl w:val="0"/>
+          <w:numId w:val="2"/>
+        </w:numPr>
+        <w:bidi w:val="false"/>
+        <w:spacing w:after="80"/>
+        <w:jc w:val="left"/>
+      </w:pPr>
+      <w:r>
+        <w:t xml:space="preserve">Images/ and imagesSmall/: menu item photography (full-size and thumbnail)</w:t>
+      </w:r>
+    </w:p>
+    <w:p>
+      <w:pPr>
+        <w:pStyle w:val="ListParagraph"/>
+        <w:numPr>
+          <w:ilvl w:val="0"/>
+          <w:numId w:val="2"/>
+        </w:numPr>
+        <w:bidi w:val="false"/>
+        <w:spacing w:after="80"/>
+        <w:jc w:val="left"/>
+      </w:pPr>
+      <w:r>
+        <w:t xml:space="preserve">nbproject/: NetBeans project configuration</w:t>
+      </w:r>
+    </w:p>
+    <w:p>
+      <w:pPr>
+        <w:pStyle w:val="ListParagraph"/>
+        <w:numPr>
+          <w:ilvl w:val="0"/>
+          <w:numId w:val="2"/>
+        </w:numPr>
+        <w:bidi w:val="false"/>
+        <w:spacing w:after="80"/>
+        <w:jc w:val="left"/>
+      </w:pPr>
+      <w:r>
+        <w:t xml:space="preserve">aldiwandb.sql: MySQL schema and seed data</w:t>
+      </w:r>
+    </w:p>
+    <w:p>
+      <w:pPr>
+        <w:pStyle w:val="ListParagraph"/>
+        <w:numPr>
+          <w:ilvl w:val="0"/>
+          <w:numId w:val="2"/>
+        </w:numPr>
+        <w:bidi w:val="false"/>
+        <w:spacing w:after="80"/>
+        <w:jc w:val="left"/>
+      </w:pPr>
+      <w:r>
+        <w:t xml:space="preserve">build.xml: Ant build script</w:t>
+      </w:r>
+    </w:p>
+    <w:p>
+      <w:pPr>
+        <w:bidi w:val="false"/>
         <w:spacing w:after="150"/>
+        <w:jc w:val="left"/>
       </w:pPr>
       <w:r>
         <w:t xml:space="preserve">Generated build output (build/, dist/) is produced locally by the build and is not stored in the repository; see the README for build instructions.</w:t>
@@ -2690,33 +2621,35 @@
     <w:p>
       <w:pPr>
         <w:pStyle w:val="Heading1"/>
+        <w:bidi w:val="false"/>
         <w:spacing w:after="200" w:before="400"/>
-      </w:pPr>
-      <w:bookmarkStart w:name="bm_15" w:id="15"/>
+        <w:jc w:val="left"/>
+      </w:pPr>
       <w:r>
         <w:t xml:space="preserve">7. Setup and Usage</w:t>
       </w:r>
-      <w:bookmarkEnd w:id="15"/>
     </w:p>
     <w:p>
       <w:pPr>
         <w:pStyle w:val="Heading2"/>
+        <w:bidi w:val="false"/>
         <w:spacing w:after="150" w:before="300"/>
-      </w:pPr>
-      <w:bookmarkStart w:name="bm_16" w:id="16"/>
+        <w:jc w:val="left"/>
+      </w:pPr>
       <w:r>
         <w:t xml:space="preserve">7.1 Prerequisites</w:t>
       </w:r>
-      <w:bookmarkEnd w:id="16"/>
-    </w:p>
-    <w:p>
-      <w:pPr>
-        <w:pStyle w:val="ListParagraph"/>
-        <w:numPr>
-          <w:ilvl w:val="0"/>
-          <w:numId w:val="2"/>
-        </w:numPr>
-        <w:spacing w:after="80"/>
+    </w:p>
+    <w:p>
+      <w:pPr>
+        <w:pStyle w:val="ListParagraph"/>
+        <w:numPr>
+          <w:ilvl w:val="0"/>
+          <w:numId w:val="2"/>
+        </w:numPr>
+        <w:bidi w:val="false"/>
+        <w:spacing w:after="80"/>
+        <w:jc w:val="left"/>
       </w:pPr>
       <w:r>
         <w:t xml:space="preserve">Java JDK 8 or later</w:t>
@@ -2729,7 +2662,9 @@
           <w:ilvl w:val="0"/>
           <w:numId w:val="2"/>
         </w:numPr>
-        <w:spacing w:after="80"/>
+        <w:bidi w:val="false"/>
+        <w:spacing w:after="80"/>
+        <w:jc w:val="left"/>
       </w:pPr>
       <w:r>
         <w:t xml:space="preserve">MySQL Server</w:t>
@@ -2742,7 +2677,9 @@
           <w:ilvl w:val="0"/>
           <w:numId w:val="2"/>
         </w:numPr>
-        <w:spacing w:after="80"/>
+        <w:bidi w:val="false"/>
+        <w:spacing w:after="80"/>
+        <w:jc w:val="left"/>
       </w:pPr>
       <w:r>
         <w:t xml:space="preserve">NetBeans IDE (recommended) or Apache Ant</w:t>
@@ -2751,22 +2688,24 @@
     <w:p>
       <w:pPr>
         <w:pStyle w:val="Heading2"/>
+        <w:bidi w:val="false"/>
         <w:spacing w:after="150" w:before="300"/>
-      </w:pPr>
-      <w:bookmarkStart w:name="bm_17" w:id="17"/>
+        <w:jc w:val="left"/>
+      </w:pPr>
       <w:r>
         <w:t xml:space="preserve">7.2 Steps</w:t>
       </w:r>
-      <w:bookmarkEnd w:id="17"/>
-    </w:p>
-    <w:p>
-      <w:pPr>
-        <w:pStyle w:val="ListParagraph"/>
-        <w:numPr>
-          <w:ilvl w:val="0"/>
-          <w:numId w:val="2"/>
-        </w:numPr>
-        <w:spacing w:after="80"/>
+    </w:p>
+    <w:p>
+      <w:pPr>
+        <w:pStyle w:val="ListParagraph"/>
+        <w:numPr>
+          <w:ilvl w:val="0"/>
+          <w:numId w:val="2"/>
+        </w:numPr>
+        <w:bidi w:val="false"/>
+        <w:spacing w:after="80"/>
+        <w:jc w:val="left"/>
       </w:pPr>
       <w:r>
         <w:t xml:space="preserve">1. Import the schema: mysql -u root -p &lt; ALDIWAN6/aldiwandb.sql</w:t>
@@ -2779,7 +2718,9 @@
           <w:ilvl w:val="0"/>
           <w:numId w:val="2"/>
         </w:numPr>
-        <w:spacing w:after="80"/>
+        <w:bidi w:val="false"/>
+        <w:spacing w:after="80"/>
+        <w:jc w:val="left"/>
       </w:pPr>
       <w:r>
         <w:t xml:space="preserve">2. Copy ALDIWAN6/src/db.properties.example to ALDIWAN6/src/db.properties and set your local MySQL URL, username, and password.</w:t>
@@ -2792,7 +2733,9 @@
           <w:ilvl w:val="0"/>
           <w:numId w:val="2"/>
         </w:numPr>
-        <w:spacing w:after="80"/>
+        <w:bidi w:val="false"/>
+        <w:spacing w:after="80"/>
+        <w:jc w:val="left"/>
       </w:pPr>
       <w:r>
         <w:t xml:space="preserve">3. Build and run via NetBeans, or from the command line: cd ALDIWAN6 &amp;&amp; ant run</w:t>
@@ -2801,17 +2744,19 @@
     <w:p>
       <w:pPr>
         <w:pStyle w:val="Heading2"/>
+        <w:bidi w:val="false"/>
         <w:spacing w:after="150" w:before="300"/>
-      </w:pPr>
-      <w:bookmarkStart w:name="bm_18" w:id="18"/>
+        <w:jc w:val="left"/>
+      </w:pPr>
       <w:r>
         <w:t xml:space="preserve">7.3 Sample Accounts</w:t>
       </w:r>
-      <w:bookmarkEnd w:id="18"/>
-    </w:p>
-    <w:p>
-      <w:pPr>
+    </w:p>
+    <w:p>
+      <w:pPr>
+        <w:bidi w:val="false"/>
         <w:spacing w:after="150"/>
+        <w:jc w:val="left"/>
       </w:pPr>
       <w:r>
         <w:t xml:space="preserve">The seeded person table includes one manager account and several staff (user) accounts, listed in aldiwandb.sql, that can be used to log in immediately after set-up.</w:t>
@@ -2820,41 +2765,45 @@
     <w:p>
       <w:pPr>
         <w:pStyle w:val="Heading1"/>
+        <w:bidi w:val="false"/>
         <w:spacing w:after="200" w:before="400"/>
-      </w:pPr>
-      <w:bookmarkStart w:name="bm_19" w:id="19"/>
+        <w:jc w:val="left"/>
+      </w:pPr>
       <w:r>
         <w:t xml:space="preserve">8. Conclusion</w:t>
       </w:r>
-      <w:bookmarkEnd w:id="19"/>
-    </w:p>
-    <w:p>
-      <w:pPr>
+    </w:p>
+    <w:p>
+      <w:pPr>
+        <w:bidi w:val="false"/>
         <w:spacing w:after="150"/>
-      </w:pPr>
-      <w:r>
-        <w:t xml:space="preserve">ALDIWAN demonstrates a complete, if intentionally small-scale, restaurant management workflow: authentication, role-based views, order taking, multiple payment paths, delivery handling, and manager-facing analytics, all backed by a relational database. As a course project it illustrates practical application of object-oriented design — class decomposition, encapsulation, and inheritance from the Swing component hierarchy — in a working, runnable desktop application.</w:t>
+        <w:jc w:val="left"/>
+      </w:pPr>
+      <w:r>
+        <w:t xml:space="preserve">ALDIWAN demonstrates a complete, if intentionally small-scale, restaurant management workflow, covering authentication, role-based views, order taking, multiple payment paths, delivery handling, and manager-facing analytics, all backed by a relational database. As a course project it illustrates practical application of object-oriented design, including class decomposition, encapsulation, and inheritance from the Swing component hierarchy, in a working, runnable desktop application.</w:t>
       </w:r>
     </w:p>
     <w:p>
       <w:pPr>
         <w:pStyle w:val="Heading2"/>
+        <w:bidi w:val="false"/>
         <w:spacing w:after="150" w:before="300"/>
-      </w:pPr>
-      <w:bookmarkStart w:name="bm_20" w:id="20"/>
+        <w:jc w:val="left"/>
+      </w:pPr>
       <w:r>
         <w:t xml:space="preserve">Possible Future Improvements</w:t>
       </w:r>
-      <w:bookmarkEnd w:id="20"/>
-    </w:p>
-    <w:p>
-      <w:pPr>
-        <w:pStyle w:val="ListParagraph"/>
-        <w:numPr>
-          <w:ilvl w:val="0"/>
-          <w:numId w:val="2"/>
-        </w:numPr>
-        <w:spacing w:after="80"/>
+    </w:p>
+    <w:p>
+      <w:pPr>
+        <w:pStyle w:val="ListParagraph"/>
+        <w:numPr>
+          <w:ilvl w:val="0"/>
+          <w:numId w:val="2"/>
+        </w:numPr>
+        <w:bidi w:val="false"/>
+        <w:spacing w:after="80"/>
+        <w:jc w:val="left"/>
       </w:pPr>
       <w:r>
         <w:t xml:space="preserve">Introduce a data-access layer to separate SQL from UI code, and use PreparedStatements consistently to guard against SQL injection.</w:t>
@@ -2867,7 +2816,9 @@
           <w:ilvl w:val="0"/>
           <w:numId w:val="2"/>
         </w:numPr>
-        <w:spacing w:after="80"/>
+        <w:bidi w:val="false"/>
+        <w:spacing w:after="80"/>
+        <w:jc w:val="left"/>
       </w:pPr>
       <w:r>
         <w:t xml:space="preserve">Add input validation and clearer error dialogs across all forms.</w:t>
@@ -2880,7 +2831,9 @@
           <w:ilvl w:val="0"/>
           <w:numId w:val="2"/>
         </w:numPr>
-        <w:spacing w:after="80"/>
+        <w:bidi w:val="false"/>
+        <w:spacing w:after="80"/>
+        <w:jc w:val="left"/>
       </w:pPr>
       <w:r>
         <w:t xml:space="preserve">Replace the plain-text password column with a properly hashed password scheme.</w:t>
@@ -2893,7 +2846,9 @@
           <w:ilvl w:val="0"/>
           <w:numId w:val="2"/>
         </w:numPr>
-        <w:spacing w:after="80"/>
+        <w:bidi w:val="false"/>
+        <w:spacing w:after="80"/>
+        <w:jc w:val="left"/>
       </w:pPr>
       <w:r>
         <w:t xml:space="preserve">Add automated tests for order-total and payment calculations.</w:t>
@@ -3113,7 +3068,12 @@
 <w:styles xmlns:mc="http://schemas.openxmlformats.org/markup-compatibility/2006" xmlns:r="http://schemas.openxmlformats.org/officeDocument/2006/relationships" xmlns:w="http://schemas.openxmlformats.org/wordprocessingml/2006/main" xmlns:w14="http://schemas.microsoft.com/office/word/2010/wordml" xmlns:w15="http://schemas.microsoft.com/office/word/2012/wordml" mc:Ignorable="w14 w15">
   <w:docDefaults>
     <w:rPrDefault/>
-    <w:pPrDefault/>
+    <w:pPrDefault>
+      <w:pPr>
+        <w:bidi w:val="false"/>
+        <w:jc w:val="left"/>
+      </w:pPr>
+    </w:pPrDefault>
   </w:docDefaults>
   <w:style w:type="paragraph" w:styleId="Title">
     <w:name w:val="Title"/>

</xml_diff>

<commit_message>
Remove third-party verification language from README and report
Rephrase the README build/run claim and two report sentences that
read as an external party's assessment rather than the project
owner's own description.
</commit_message>
<xml_diff>
--- a/docs/ALDIWAN_Project_Report.docx
+++ b/docs/ALDIWAN_Project_Report.docx
@@ -651,7 +651,7 @@
         <w:jc w:val="left"/>
       </w:pPr>
       <w:r>
-        <w:t xml:space="preserve">The application follows a straightforward layered structure typical of a small Swing/JDBC desktop project. Swing JFrame subclasses act as both the view and controller for each screen, and a single connection-holder class centralizes access to the database. There is no separate persistence or service layer; each screen issues its own SQL through JDBC, which keeps the project simple and traceable for a course assignment of this scope.</w:t>
+        <w:t xml:space="preserve">The application follows a straightforward layered structure typical of a small Swing/JDBC desktop project. Swing JFrame subclasses act as both the view and controller for each screen, and a single connection-holder class centralizes access to the database. There is no separate persistence or service layer; each screen issues its own SQL through JDBC directly.</w:t>
       </w:r>
     </w:p>
     <w:p>
@@ -2780,7 +2780,7 @@
         <w:jc w:val="left"/>
       </w:pPr>
       <w:r>
-        <w:t xml:space="preserve">ALDIWAN demonstrates a complete, if intentionally small-scale, restaurant management workflow, covering authentication, role-based views, order taking, multiple payment paths, delivery handling, and manager-facing analytics, all backed by a relational database. As a course project it illustrates practical application of object-oriented design, including class decomposition, encapsulation, and inheritance from the Swing component hierarchy, in a working, runnable desktop application.</w:t>
+        <w:t xml:space="preserve">ALDIWAN delivers a complete restaurant management workflow, covering authentication, role-based views, order taking, multiple payment paths, delivery handling, and manager-facing analytics, all backed by a relational database. It puts object-oriented design into practice, including class decomposition, encapsulation, and inheritance from the Swing component hierarchy, in a working, runnable desktop application.</w:t>
       </w:r>
     </w:p>
     <w:p>

</xml_diff>